<commit_message>
Una sola Nueva reserva para el personal y manual de usuario 3.0
El menu Nueva Reserva llevaba al admin y al operador al asistente del
cliente, que les respondia que su cuenta no podia reservar. Queda solo
para clientes; el personal usa el boton Nueva reserva de Reservas.

Manual de usuario 3.0: ciudad, lavado a domicilio, pago antes del lavado,
plan VIP, cuentas de empresa y Mi flota, equipo a domicilio del lavador,
bloqueos con alcance.

Co-Authored-By: Claude Opus 5.5 (1M context) <noreply@anthropic.com>
</commit_message>
<xml_diff>
--- a/docs/07_MANUAL_USUARIO/Manual_Usuario.docx
+++ b/docs/07_MANUAL_USUARIO/Manual_Usuario.docx
@@ -21,6 +21,20 @@
       <w:r>
         <w:t xml:space="preserve">usuario</w:t>
       </w:r>
+    </w:p>
+    <w:p>
+      <w:pPr>
+        <w:pStyle w:val="Author"/>
+      </w:pPr>
+      <w:r>
+        <w:t xml:space="preserve">Auditoria</w:t>
+      </w:r>
+      <w:r>
+        <w:t xml:space="preserve"> </w:t>
+      </w:r>
+      <w:r>
+        <w:t xml:space="preserve">tecnica</w:t>
+      </w:r>
       <w:r>
         <w:t xml:space="preserve"> </w:t>
       </w:r>
@@ -37,64 +51,6 @@
         <w:t xml:space="preserve"> </w:t>
       </w:r>
       <w:r>
-        <w:t xml:space="preserve">Clean</w:t>
-      </w:r>
-      <w:r>
-        <w:t xml:space="preserve"> </w:t>
-      </w:r>
-      <w:r>
-        <w:t xml:space="preserve">Car</w:t>
-      </w:r>
-    </w:p>
-    <w:p>
-      <w:pPr>
-        <w:pStyle w:val="Subtitle"/>
-      </w:pPr>
-      <w:r>
-        <w:t xml:space="preserve">Total</w:t>
-      </w:r>
-      <w:r>
-        <w:t xml:space="preserve"> </w:t>
-      </w:r>
-      <w:r>
-        <w:t xml:space="preserve">Clean</w:t>
-      </w:r>
-      <w:r>
-        <w:t xml:space="preserve"> </w:t>
-      </w:r>
-      <w:r>
-        <w:t xml:space="preserve">Car</w:t>
-      </w:r>
-    </w:p>
-    <w:p>
-      <w:pPr>
-        <w:pStyle w:val="Author"/>
-      </w:pPr>
-      <w:r>
-        <w:t xml:space="preserve">Auditoria</w:t>
-      </w:r>
-      <w:r>
-        <w:t xml:space="preserve"> </w:t>
-      </w:r>
-      <w:r>
-        <w:t xml:space="preserve">tecnica</w:t>
-      </w:r>
-      <w:r>
-        <w:t xml:space="preserve"> </w:t>
-      </w:r>
-      <w:r>
-        <w:t xml:space="preserve">—</w:t>
-      </w:r>
-      <w:r>
-        <w:t xml:space="preserve"> </w:t>
-      </w:r>
-      <w:r>
-        <w:t xml:space="preserve">Total</w:t>
-      </w:r>
-      <w:r>
-        <w:t xml:space="preserve"> </w:t>
-      </w:r>
-      <w:r>
         <w:t xml:space="preserve">Pacific</w:t>
       </w:r>
       <w:r>
@@ -115,7 +71,7 @@
         <w:t xml:space="preserve"> </w:t>
       </w:r>
       <w:r>
-        <w:t xml:space="preserve">2.1</w:t>
+        <w:t xml:space="preserve">1.0</w:t>
       </w:r>
       <w:r>
         <w:t xml:space="preserve"> </w:t>
@@ -127,7 +83,7 @@
         <w:t xml:space="preserve"> </w:t>
       </w:r>
       <w:r>
-        <w:t xml:space="preserve">11</w:t>
+        <w:t xml:space="preserve">12</w:t>
       </w:r>
       <w:r>
         <w:t xml:space="preserve"> </w:t>
@@ -185,7 +141,7 @@
         <w:pStyle w:val="FirstParagraph"/>
       </w:pPr>
       <w:r>
-        <w:t xml:space="preserve">Versión 2.1 · 2026-10-08 (6.1 ampliada, 6.6 Reportes nueva) · Reemplaza a la 2.0 (2026-09-27) y a la versión 1.0 (2026-09-15,</w:t>
+        <w:t xml:space="preserve">Versión 3.0 · 2026-10-12 (ciudades, empresas, lavado a domicilio, plan VIP y pago antes del lavado) · Reemplaza a la 2.1 (2026-10-08), a la 2.0 (2026-09-27) y a la 1.0 (2026-09-15,</w:t>
       </w:r>
       <w:r>
         <w:t xml:space="preserve"> </w:t>
@@ -266,13 +222,19 @@
         <w:pStyle w:val="FirstParagraph"/>
       </w:pPr>
       <w:r>
-        <w:t xml:space="preserve">Total Clean Car permite reservar el lavado de un vehículo en su estacionamiento o en</w:t>
-      </w:r>
-      <w:r>
-        <w:t xml:space="preserve"> </w:t>
-      </w:r>
-      <w:r>
-        <w:t xml:space="preserve">la bahía del taller, y coordina a quienes lo hacen. Cada persona entra con su</w:t>
+        <w:t xml:space="preserve">Total Clean Car permite reservar el lavado de un vehículo en su estacionamiento, en</w:t>
+      </w:r>
+      <w:r>
+        <w:t xml:space="preserve"> </w:t>
+      </w:r>
+      <w:r>
+        <w:t xml:space="preserve">la bahía del taller o a domicilio, en cualquiera de las ciudades donde opera, y</w:t>
+      </w:r>
+      <w:r>
+        <w:t xml:space="preserve"> </w:t>
+      </w:r>
+      <w:r>
+        <w:t xml:space="preserve">coordina a quienes lo hacen. Cada persona entra con su</w:t>
       </w:r>
       <w:r>
         <w:t xml:space="preserve"> </w:t>
@@ -344,19 +306,19 @@
               <w:jc w:val="left"/>
             </w:pPr>
             <w:r>
-              <w:t xml:space="preserve">Cliente</w:t>
-            </w:r>
-          </w:p>
-        </w:tc>
-        <w:tc>
-          <w:tcPr/>
-          <w:p>
-            <w:pPr>
-              <w:pStyle w:val="Compact"/>
-              <w:jc w:val="left"/>
-            </w:pPr>
-            <w:r>
-              <w:t xml:space="preserve">Reserva lavados, paga, sigue el estado y califica</w:t>
+              <w:t xml:space="preserve">Cliente (persona)</w:t>
+            </w:r>
+          </w:p>
+        </w:tc>
+        <w:tc>
+          <w:tcPr/>
+          <w:p>
+            <w:pPr>
+              <w:pStyle w:val="Compact"/>
+              <w:jc w:val="left"/>
+            </w:pPr>
+            <w:r>
+              <w:t xml:space="preserve">Reserva lavados, paga, sigue el estado y califica; puede tener plan VIP</w:t>
             </w:r>
           </w:p>
         </w:tc>
@@ -382,31 +344,31 @@
               <w:jc w:val="left"/>
             </w:pPr>
             <w:r>
-              <w:t xml:space="preserve">Lavador</w:t>
-            </w:r>
-          </w:p>
-        </w:tc>
-        <w:tc>
-          <w:tcPr/>
-          <w:p>
-            <w:pPr>
-              <w:pStyle w:val="Compact"/>
-              <w:jc w:val="left"/>
-            </w:pPr>
-            <w:r>
-              <w:t xml:space="preserve">Ve sus trabajos del día, sube fotos y marca el avance</w:t>
-            </w:r>
-          </w:p>
-        </w:tc>
-        <w:tc>
-          <w:tcPr/>
-          <w:p>
-            <w:pPr>
-              <w:pStyle w:val="Compact"/>
-              <w:jc w:val="left"/>
-            </w:pPr>
-            <w:r>
-              <w:t xml:space="preserve">Mis Trabajos</w:t>
+              <w:t xml:space="preserve">Cliente (empresa)</w:t>
+            </w:r>
+          </w:p>
+        </w:tc>
+        <w:tc>
+          <w:tcPr/>
+          <w:p>
+            <w:pPr>
+              <w:pStyle w:val="Compact"/>
+              <w:jc w:val="left"/>
+            </w:pPr>
+            <w:r>
+              <w:t xml:space="preserve">Lo mismo que una persona, pero a crédito con tarifa propia; ve el gasto de su flota</w:t>
+            </w:r>
+          </w:p>
+        </w:tc>
+        <w:tc>
+          <w:tcPr/>
+          <w:p>
+            <w:pPr>
+              <w:pStyle w:val="Compact"/>
+              <w:jc w:val="left"/>
+            </w:pPr>
+            <w:r>
+              <w:t xml:space="preserve">Mis Reservas</w:t>
             </w:r>
           </w:p>
         </w:tc>
@@ -420,31 +382,31 @@
               <w:jc w:val="left"/>
             </w:pPr>
             <w:r>
-              <w:t xml:space="preserve">Operador</w:t>
-            </w:r>
-          </w:p>
-        </w:tc>
-        <w:tc>
-          <w:tcPr/>
-          <w:p>
-            <w:pPr>
-              <w:pStyle w:val="Compact"/>
-              <w:jc w:val="left"/>
-            </w:pPr>
-            <w:r>
-              <w:t xml:space="preserve">Confirma reservas, asigna lavadores y valida pagos</w:t>
-            </w:r>
-          </w:p>
-        </w:tc>
-        <w:tc>
-          <w:tcPr/>
-          <w:p>
-            <w:pPr>
-              <w:pStyle w:val="Compact"/>
-              <w:jc w:val="left"/>
-            </w:pPr>
-            <w:r>
-              <w:t xml:space="preserve">Dashboard (en el celular, Agenda)</w:t>
+              <w:t xml:space="preserve">Lavador</w:t>
+            </w:r>
+          </w:p>
+        </w:tc>
+        <w:tc>
+          <w:tcPr/>
+          <w:p>
+            <w:pPr>
+              <w:pStyle w:val="Compact"/>
+              <w:jc w:val="left"/>
+            </w:pPr>
+            <w:r>
+              <w:t xml:space="preserve">Ve sus trabajos del día, sube fotos y marca el avance</w:t>
+            </w:r>
+          </w:p>
+        </w:tc>
+        <w:tc>
+          <w:tcPr/>
+          <w:p>
+            <w:pPr>
+              <w:pStyle w:val="Compact"/>
+              <w:jc w:val="left"/>
+            </w:pPr>
+            <w:r>
+              <w:t xml:space="preserve">Mis Trabajos</w:t>
             </w:r>
           </w:p>
         </w:tc>
@@ -458,6 +420,44 @@
               <w:jc w:val="left"/>
             </w:pPr>
             <w:r>
+              <w:t xml:space="preserve">Operador</w:t>
+            </w:r>
+          </w:p>
+        </w:tc>
+        <w:tc>
+          <w:tcPr/>
+          <w:p>
+            <w:pPr>
+              <w:pStyle w:val="Compact"/>
+              <w:jc w:val="left"/>
+            </w:pPr>
+            <w:r>
+              <w:t xml:space="preserve">Confirma reservas, asigna lavadores y valida pagos, de su ciudad (o de todo el país)</w:t>
+            </w:r>
+          </w:p>
+        </w:tc>
+        <w:tc>
+          <w:tcPr/>
+          <w:p>
+            <w:pPr>
+              <w:pStyle w:val="Compact"/>
+              <w:jc w:val="left"/>
+            </w:pPr>
+            <w:r>
+              <w:t xml:space="preserve">Dashboard (en el celular, Agenda)</w:t>
+            </w:r>
+          </w:p>
+        </w:tc>
+      </w:tr>
+      <w:tr>
+        <w:tc>
+          <w:tcPr/>
+          <w:p>
+            <w:pPr>
+              <w:pStyle w:val="Compact"/>
+              <w:jc w:val="left"/>
+            </w:pPr>
+            <w:r>
               <w:t xml:space="preserve">Administrador</w:t>
             </w:r>
           </w:p>
@@ -493,7 +493,7 @@
         <w:pStyle w:val="BodyText"/>
       </w:pPr>
       <w:r>
-        <w:t xml:space="preserve">Hay dos modalidades de servicio:</w:t>
+        <w:t xml:space="preserve">Hay tres formas de recibir el servicio:</w:t>
       </w:r>
     </w:p>
     <w:p>
@@ -531,18 +531,64 @@
           <w:b/>
           <w:bCs/>
         </w:rPr>
+        <w:t xml:space="preserve">A domicilio:</w:t>
+      </w:r>
+      <w:r>
+        <w:t xml:space="preserve"> </w:t>
+      </w:r>
+      <w:r>
+        <w:t xml:space="preserve">un equipo móvil va a la casa u oficina del cliente, con un recargo según el sector.</w:t>
+      </w:r>
+    </w:p>
+    <w:p>
+      <w:pPr>
+        <w:pStyle w:val="Compact"/>
+        <w:numPr>
+          <w:ilvl w:val="0"/>
+          <w:numId w:val="1001"/>
+        </w:numPr>
+      </w:pPr>
+      <w:r>
+        <w:rPr>
+          <w:b/>
+          <w:bCs/>
+        </w:rPr>
         <w:t xml:space="preserve">Limpieza profunda:</w:t>
       </w:r>
       <w:r>
         <w:t xml:space="preserve"> </w:t>
       </w:r>
       <w:r>
-        <w:t xml:space="preserve">el cliente lleva el vehículo a una bahía del taller.</w:t>
+        <w:t xml:space="preserve">el cliente lleva el vehículo a una bahía del taller de su ciudad.</w:t>
       </w:r>
     </w:p>
     <w:p>
       <w:pPr>
         <w:pStyle w:val="FirstParagraph"/>
+      </w:pPr>
+      <w:r>
+        <w:rPr>
+          <w:b/>
+          <w:bCs/>
+        </w:rPr>
+        <w:t xml:space="preserve">Todo lavado se paga antes de realizarlo</w:t>
+      </w:r>
+      <w:r>
+        <w:t xml:space="preserve"> </w:t>
+      </w:r>
+      <w:r>
+        <w:t xml:space="preserve">(sección 4.1). La excepción son las</w:t>
+      </w:r>
+      <w:r>
+        <w:t xml:space="preserve"> </w:t>
+      </w:r>
+      <w:r>
+        <w:t xml:space="preserve">empresas: se lavan a crédito y pagan con la factura del corte mensual.</w:t>
+      </w:r>
+    </w:p>
+    <w:p>
+      <w:pPr>
+        <w:pStyle w:val="BodyText"/>
       </w:pPr>
       <w:r>
         <w:t xml:space="preserve">Se puede usar de dos formas, con el mismo usuario y los mismos datos:</w:t>
@@ -1223,7 +1269,7 @@
     </w:p>
     <w:bookmarkEnd w:id="32"/>
     <w:bookmarkEnd w:id="33"/>
-    <w:bookmarkStart w:id="49" w:name="cliente-reservar-un-lavado"/>
+    <w:bookmarkStart w:id="50" w:name="cliente-reservar-un-lavado"/>
     <w:p>
       <w:pPr>
         <w:pStyle w:val="Heading2"/>
@@ -1419,7 +1465,39 @@
         <w:t xml:space="preserve"> </w:t>
       </w:r>
       <w:r>
-        <w:t xml:space="preserve">Para un servicio expreso, elija el estacionamiento donde está el vehículo. La limpieza profunda se hace en la bahía del taller y no pide lugar.</w:t>
+        <w:t xml:space="preserve">Primero la</w:t>
+      </w:r>
+      <w:r>
+        <w:t xml:space="preserve"> </w:t>
+      </w:r>
+      <w:r>
+        <w:rPr>
+          <w:b/>
+          <w:bCs/>
+        </w:rPr>
+        <w:t xml:space="preserve">ciudad</w:t>
+      </w:r>
+      <w:r>
+        <w:t xml:space="preserve"> </w:t>
+      </w:r>
+      <w:r>
+        <w:t xml:space="preserve">(el teléfono la recuerda para la próxima vez). Para un servicio expreso, elija el estacionamiento donde está el vehículo o</w:t>
+      </w:r>
+      <w:r>
+        <w:t xml:space="preserve"> </w:t>
+      </w:r>
+      <w:r>
+        <w:rPr>
+          <w:b/>
+          <w:bCs/>
+        </w:rPr>
+        <w:t xml:space="preserve">A domicilio</w:t>
+      </w:r>
+      <w:r>
+        <w:t xml:space="preserve"> </w:t>
+      </w:r>
+      <w:r>
+        <w:t xml:space="preserve">(ver 3.1). La limpieza profunda se hace en el taller de esa ciudad y no pide lugar.</w:t>
       </w:r>
     </w:p>
     <w:p>
@@ -1441,7 +1519,7 @@
         <w:t xml:space="preserve"> </w:t>
       </w:r>
       <w:r>
-        <w:t xml:space="preserve">Elija el día en la tira de fechas (hasta dos semanas) y luego la hora. Cada horario muestra los cupos que quedan; los agotados aparecen tachados y los de hoy que ya pasaron no se muestran.</w:t>
+        <w:t xml:space="preserve">Elija el día en la tira de fechas (hasta dos semanas; con plan VIP, los días que dé su plan) y luego la hora. Cada horario muestra los cupos que quedan; los agotados aparecen tachados y los de hoy que ya pasaron no se muestran.</w:t>
       </w:r>
     </w:p>
     <w:p>
@@ -1896,7 +1974,34 @@
         <w:t xml:space="preserve"> </w:t>
       </w:r>
       <w:r>
-        <w:t xml:space="preserve">hasta que el operador la confirma.</w:t>
+        <w:t xml:space="preserve">hasta que el operador la confirma. El boleto recuerda que</w:t>
+      </w:r>
+      <w:r>
+        <w:t xml:space="preserve"> </w:t>
+      </w:r>
+      <w:r>
+        <w:rPr>
+          <w:b/>
+          <w:bCs/>
+        </w:rPr>
+        <w:t xml:space="preserve">el lavado se paga antes</w:t>
+      </w:r>
+      <w:r>
+        <w:rPr>
+          <w:b/>
+          <w:bCs/>
+        </w:rPr>
+        <w:t xml:space="preserve"> </w:t>
+      </w:r>
+      <w:r>
+        <w:rPr>
+          <w:b/>
+          <w:bCs/>
+        </w:rPr>
+        <w:t xml:space="preserve">de realizarlo</w:t>
+      </w:r>
+      <w:r>
+        <w:t xml:space="preserve">: transfiera y suba el comprobante desde Mis Reservas (sección 4.1).</w:t>
       </w:r>
     </w:p>
     <w:p>
@@ -1929,6 +2034,347 @@
           <w:b/>
           <w:bCs/>
         </w:rPr>
+        <w:t xml:space="preserve">Si tiene plan VIP</w:t>
+      </w:r>
+      <w:r>
+        <w:t xml:space="preserve"> </w:t>
+      </w:r>
+      <w:r>
+        <w:t xml:space="preserve">(sección 4.5), el boleto muestra el precio tachado y lo que</w:t>
+      </w:r>
+      <w:r>
+        <w:t xml:space="preserve"> </w:t>
+      </w:r>
+      <w:r>
+        <w:t xml:space="preserve">paga con su plan:</w:t>
+      </w:r>
+      <w:r>
+        <w:t xml:space="preserve"> </w:t>
+      </w:r>
+      <w:r>
+        <w:t xml:space="preserve">“</w:t>
+      </w:r>
+      <w:r>
+        <w:t xml:space="preserve">Incluido en tu plan</w:t>
+      </w:r>
+      <w:r>
+        <w:t xml:space="preserve">”</w:t>
+      </w:r>
+      <w:r>
+        <w:t xml:space="preserve"> </w:t>
+      </w:r>
+      <w:r>
+        <w:t xml:space="preserve">mientras le queden lavados del mes, o el</w:t>
+      </w:r>
+      <w:r>
+        <w:t xml:space="preserve"> </w:t>
+      </w:r>
+      <w:r>
+        <w:t xml:space="preserve">descuento cuando ya los usó.</w:t>
+      </w:r>
+    </w:p>
+    <w:bookmarkStart w:id="49" w:name="lavado-a-domicilio"/>
+    <w:p>
+      <w:pPr>
+        <w:pStyle w:val="Heading3"/>
+      </w:pPr>
+      <w:r>
+        <w:rPr>
+          <w:rStyle w:val="SectionNumber"/>
+        </w:rPr>
+        <w:t xml:space="preserve">0.3.1</w:t>
+      </w:r>
+      <w:r>
+        <w:tab/>
+      </w:r>
+      <w:r>
+        <w:t xml:space="preserve">3.1 Lavado a domicilio</w:t>
+      </w:r>
+    </w:p>
+    <w:p>
+      <w:pPr>
+        <w:pStyle w:val="FirstParagraph"/>
+      </w:pPr>
+      <w:r>
+        <w:t xml:space="preserve">En el paso</w:t>
+      </w:r>
+      <w:r>
+        <w:t xml:space="preserve"> </w:t>
+      </w:r>
+      <w:r>
+        <w:rPr>
+          <w:b/>
+          <w:bCs/>
+        </w:rPr>
+        <w:t xml:space="preserve">Lugar</w:t>
+      </w:r>
+      <w:r>
+        <w:t xml:space="preserve">, toque</w:t>
+      </w:r>
+      <w:r>
+        <w:t xml:space="preserve"> </w:t>
+      </w:r>
+      <w:r>
+        <w:rPr>
+          <w:b/>
+          <w:bCs/>
+        </w:rPr>
+        <w:t xml:space="preserve">A domicilio</w:t>
+      </w:r>
+      <w:r>
+        <w:t xml:space="preserve"> </w:t>
+      </w:r>
+      <w:r>
+        <w:t xml:space="preserve">y complete:</w:t>
+      </w:r>
+    </w:p>
+    <w:p>
+      <w:pPr>
+        <w:pStyle w:val="Compact"/>
+        <w:numPr>
+          <w:ilvl w:val="0"/>
+          <w:numId w:val="1007"/>
+        </w:numPr>
+      </w:pPr>
+      <w:r>
+        <w:rPr>
+          <w:b/>
+          <w:bCs/>
+        </w:rPr>
+        <w:t xml:space="preserve">Sector:</w:t>
+      </w:r>
+      <w:r>
+        <w:t xml:space="preserve"> </w:t>
+      </w:r>
+      <w:r>
+        <w:t xml:space="preserve">elija el suyo de la lista. Debajo se ve el</w:t>
+      </w:r>
+      <w:r>
+        <w:t xml:space="preserve"> </w:t>
+      </w:r>
+      <w:r>
+        <w:rPr>
+          <w:b/>
+          <w:bCs/>
+        </w:rPr>
+        <w:t xml:space="preserve">recargo por visita</w:t>
+      </w:r>
+      <w:r>
+        <w:t xml:space="preserve"> </w:t>
+      </w:r>
+      <w:r>
+        <w:t xml:space="preserve">de ese sector. Si su zona no aparece, todavía no llegamos ahí.</w:t>
+      </w:r>
+    </w:p>
+    <w:p>
+      <w:pPr>
+        <w:pStyle w:val="Compact"/>
+        <w:numPr>
+          <w:ilvl w:val="0"/>
+          <w:numId w:val="1007"/>
+        </w:numPr>
+      </w:pPr>
+      <w:r>
+        <w:rPr>
+          <w:b/>
+          <w:bCs/>
+        </w:rPr>
+        <w:t xml:space="preserve">Dirección</w:t>
+      </w:r>
+      <w:r>
+        <w:t xml:space="preserve"> </w:t>
+      </w:r>
+      <w:r>
+        <w:t xml:space="preserve">y</w:t>
+      </w:r>
+      <w:r>
+        <w:t xml:space="preserve"> </w:t>
+      </w:r>
+      <w:r>
+        <w:rPr>
+          <w:b/>
+          <w:bCs/>
+        </w:rPr>
+        <w:t xml:space="preserve">referencia</w:t>
+      </w:r>
+      <w:r>
+        <w:t xml:space="preserve"> </w:t>
+      </w:r>
+      <w:r>
+        <w:t xml:space="preserve">(por ejemplo</w:t>
+      </w:r>
+      <w:r>
+        <w:t xml:space="preserve"> </w:t>
+      </w:r>
+      <w:r>
+        <w:t xml:space="preserve">“</w:t>
+      </w:r>
+      <w:r>
+        <w:t xml:space="preserve">portón negro, junto a la farmacia</w:t>
+      </w:r>
+      <w:r>
+        <w:t xml:space="preserve">”</w:t>
+      </w:r>
+      <w:r>
+        <w:t xml:space="preserve">).</w:t>
+      </w:r>
+    </w:p>
+    <w:p>
+      <w:pPr>
+        <w:pStyle w:val="Compact"/>
+        <w:numPr>
+          <w:ilvl w:val="0"/>
+          <w:numId w:val="1007"/>
+        </w:numPr>
+      </w:pPr>
+      <w:r>
+        <w:rPr>
+          <w:b/>
+          <w:bCs/>
+        </w:rPr>
+        <w:t xml:space="preserve">Quién recibe al equipo</w:t>
+      </w:r>
+      <w:r>
+        <w:t xml:space="preserve"> </w:t>
+      </w:r>
+      <w:r>
+        <w:t xml:space="preserve">y un</w:t>
+      </w:r>
+      <w:r>
+        <w:t xml:space="preserve"> </w:t>
+      </w:r>
+      <w:r>
+        <w:rPr>
+          <w:b/>
+          <w:bCs/>
+        </w:rPr>
+        <w:t xml:space="preserve">teléfono de contacto</w:t>
+      </w:r>
+      <w:r>
+        <w:t xml:space="preserve">.</w:t>
+      </w:r>
+    </w:p>
+    <w:p>
+      <w:pPr>
+        <w:pStyle w:val="Compact"/>
+        <w:numPr>
+          <w:ilvl w:val="0"/>
+          <w:numId w:val="1007"/>
+        </w:numPr>
+      </w:pPr>
+      <w:r>
+        <w:rPr>
+          <w:b/>
+          <w:bCs/>
+        </w:rPr>
+        <w:t xml:space="preserve">Usar mi ubicación</w:t>
+      </w:r>
+      <w:r>
+        <w:t xml:space="preserve"> </w:t>
+      </w:r>
+      <w:r>
+        <w:t xml:space="preserve">es opcional y ayuda al equipo a encontrarlo; basta con la dirección.</w:t>
+      </w:r>
+    </w:p>
+    <w:p>
+      <w:pPr>
+        <w:pStyle w:val="FirstParagraph"/>
+      </w:pPr>
+      <w:r>
+        <w:rPr>
+          <w:b/>
+          <w:bCs/>
+        </w:rPr>
+        <w:t xml:space="preserve">El agua y la luz las pone usted.</w:t>
+      </w:r>
+      <w:r>
+        <w:t xml:space="preserve"> </w:t>
+      </w:r>
+      <w:r>
+        <w:t xml:space="preserve">Sin ellas no se puede lavar y la visita se</w:t>
+      </w:r>
+      <w:r>
+        <w:t xml:space="preserve"> </w:t>
+      </w:r>
+      <w:r>
+        <w:t xml:space="preserve">cobra igual. Lo mismo si el vehículo no está o no hay acceso al lugar.</w:t>
+      </w:r>
+    </w:p>
+    <w:p>
+      <w:pPr>
+        <w:pStyle w:val="BodyText"/>
+      </w:pPr>
+      <w:r>
+        <w:t xml:space="preserve">El equipo sale a su dirección antes de la hora elegida. En Mis Reservas la tarjeta</w:t>
+      </w:r>
+      <w:r>
+        <w:t xml:space="preserve"> </w:t>
+      </w:r>
+      <w:r>
+        <w:t xml:space="preserve">dice</w:t>
+      </w:r>
+      <w:r>
+        <w:t xml:space="preserve"> </w:t>
+      </w:r>
+      <w:r>
+        <w:rPr>
+          <w:b/>
+          <w:bCs/>
+        </w:rPr>
+        <w:t xml:space="preserve">“</w:t>
+      </w:r>
+      <w:r>
+        <w:rPr>
+          <w:b/>
+          <w:bCs/>
+        </w:rPr>
+        <w:t xml:space="preserve">Nuestro equipo va en camino</w:t>
+      </w:r>
+      <w:r>
+        <w:rPr>
+          <w:b/>
+          <w:bCs/>
+        </w:rPr>
+        <w:t xml:space="preserve">”</w:t>
+      </w:r>
+      <w:r>
+        <w:t xml:space="preserve"> </w:t>
+      </w:r>
+      <w:r>
+        <w:t xml:space="preserve">cuando sale. Si no se pudo lavar, la reserva</w:t>
+      </w:r>
+      <w:r>
+        <w:t xml:space="preserve"> </w:t>
+      </w:r>
+      <w:r>
+        <w:t xml:space="preserve">queda como</w:t>
+      </w:r>
+      <w:r>
+        <w:t xml:space="preserve"> </w:t>
+      </w:r>
+      <w:r>
+        <w:rPr>
+          <w:b/>
+          <w:bCs/>
+        </w:rPr>
+        <w:t xml:space="preserve">visita fallida</w:t>
+      </w:r>
+      <w:r>
+        <w:t xml:space="preserve"> </w:t>
+      </w:r>
+      <w:r>
+        <w:t xml:space="preserve">con el motivo, y se cobra el cargo de visita.</w:t>
+      </w:r>
+    </w:p>
+    <w:p>
+      <w:pPr>
+        <w:pStyle w:val="BodyText"/>
+      </w:pPr>
+      <w:r>
+        <w:rPr>
+          <w:b/>
+          <w:bCs/>
+        </w:rPr>
         <w:t xml:space="preserve">Si al confirmar aparece</w:t>
       </w:r>
       <w:r>
@@ -1970,7 +2416,8 @@
       </w:r>
     </w:p>
     <w:bookmarkEnd w:id="49"/>
-    <w:bookmarkStart w:id="60" w:name="cliente-seguir-pagar-y-calificar"/>
+    <w:bookmarkEnd w:id="50"/>
+    <w:bookmarkStart w:id="63" w:name="cliente-seguir-pagar-y-calificar"/>
     <w:p>
       <w:pPr>
         <w:pStyle w:val="Heading2"/>
@@ -2024,18 +2471,18 @@
           <wp:inline>
             <wp:extent cx="5334000" cy="3902926"/>
             <wp:effectExtent b="0" l="0" r="0" t="0"/>
-            <wp:docPr descr="Figura 8" title="" id="51" name="Picture"/>
+            <wp:docPr descr="Figura 8" title="" id="52" name="Picture"/>
             <a:graphic>
               <a:graphicData uri="http://schemas.openxmlformats.org/drawingml/2006/picture">
                 <pic:pic>
                   <pic:nvPicPr>
-                    <pic:cNvPr descr="img/fig08-mis-reservas.png" id="52" name="Picture"/>
+                    <pic:cNvPr descr="img/fig08-mis-reservas.png" id="53" name="Picture"/>
                     <pic:cNvPicPr>
                       <a:picLocks noChangeArrowheads="1" noChangeAspect="1"/>
                     </pic:cNvPicPr>
                   </pic:nvPicPr>
                   <pic:blipFill>
-                    <a:blip r:embed="rId50"/>
+                    <a:blip r:embed="rId51"/>
                     <a:stretch>
                       <a:fillRect/>
                     </a:stretch>
@@ -2097,18 +2544,18 @@
           <wp:inline>
             <wp:extent cx="5334000" cy="2157845"/>
             <wp:effectExtent b="0" l="0" r="0" t="0"/>
-            <wp:docPr descr="Figura 9" title="" id="54" name="Picture"/>
+            <wp:docPr descr="Figura 9" title="" id="55" name="Picture"/>
             <a:graphic>
               <a:graphicData uri="http://schemas.openxmlformats.org/drawingml/2006/picture">
                 <pic:pic>
                   <pic:nvPicPr>
-                    <pic:cNvPr descr="img/fig09-estados-reserva.png" id="55" name="Picture"/>
+                    <pic:cNvPr descr="img/fig09-estados-reserva.png" id="56" name="Picture"/>
                     <pic:cNvPicPr>
                       <a:picLocks noChangeArrowheads="1" noChangeAspect="1"/>
                     </pic:cNvPicPr>
                   </pic:nvPicPr>
                   <pic:blipFill>
-                    <a:blip r:embed="rId53"/>
+                    <a:blip r:embed="rId54"/>
                     <a:stretch>
                       <a:fillRect/>
                     </a:stretch>
@@ -2216,7 +2663,7 @@
         <w:t xml:space="preserve">teléfono registrado.</w:t>
       </w:r>
     </w:p>
-    <w:bookmarkStart w:id="56" w:name="pagar-por-transferencia"/>
+    <w:bookmarkStart w:id="57" w:name="pagar-antes-del-lavado-transferencia"/>
     <w:p>
       <w:pPr>
         <w:pStyle w:val="Heading3"/>
@@ -2231,80 +2678,75 @@
         <w:tab/>
       </w:r>
       <w:r>
-        <w:t xml:space="preserve">4.1 Pagar por transferencia</w:t>
-      </w:r>
-    </w:p>
-    <w:p>
-      <w:pPr>
-        <w:pStyle w:val="Compact"/>
-        <w:numPr>
-          <w:ilvl w:val="0"/>
-          <w:numId w:val="1007"/>
-        </w:numPr>
-      </w:pPr>
-      <w:r>
-        <w:t xml:space="preserve">Transfiera el total a la cuenta que le indique la empresa.</w:t>
-      </w:r>
-    </w:p>
-    <w:p>
-      <w:pPr>
-        <w:pStyle w:val="Compact"/>
-        <w:numPr>
-          <w:ilvl w:val="0"/>
-          <w:numId w:val="1007"/>
-        </w:numPr>
-      </w:pPr>
-      <w:r>
-        <w:t xml:space="preserve">En la reserva toque</w:t>
-      </w:r>
-      <w:r>
-        <w:t xml:space="preserve"> </w:t>
-      </w:r>
-      <w:r>
-        <w:rPr>
-          <w:b/>
-          <w:bCs/>
-        </w:rPr>
-        <w:t xml:space="preserve">Pagar</w:t>
-      </w:r>
-      <w:r>
-        <w:t xml:space="preserve"> </w:t>
-      </w:r>
-      <w:r>
-        <w:t xml:space="preserve">y adjunte el comprobante, el monto y, si lo tiene, el número de transferencia.</w:t>
-      </w:r>
-    </w:p>
-    <w:p>
-      <w:pPr>
-        <w:pStyle w:val="Compact"/>
-        <w:numPr>
-          <w:ilvl w:val="0"/>
-          <w:numId w:val="1007"/>
-        </w:numPr>
-      </w:pPr>
-      <w:r>
-        <w:t xml:space="preserve">Toque</w:t>
-      </w:r>
-      <w:r>
-        <w:t xml:space="preserve"> </w:t>
-      </w:r>
-      <w:r>
-        <w:rPr>
-          <w:b/>
-          <w:bCs/>
-        </w:rPr>
-        <w:t xml:space="preserve">Enviar comprobante</w:t>
-      </w:r>
-      <w:r>
-        <w:t xml:space="preserve">. La tarjeta muestra</w:t>
-      </w:r>
-      <w:r>
-        <w:t xml:space="preserve"> </w:t>
-      </w:r>
-      <w:r>
+        <w:t xml:space="preserve">4.1 Pagar antes del lavado (transferencia)</w:t>
+      </w:r>
+    </w:p>
+    <w:p>
+      <w:pPr>
+        <w:pStyle w:val="FirstParagraph"/>
+      </w:pPr>
+      <w:r>
+        <w:rPr>
+          <w:b/>
+          <w:bCs/>
+        </w:rPr>
+        <w:t xml:space="preserve">El lavado se realiza cuando el pago está confirmado.</w:t>
+      </w:r>
+      <w:r>
+        <w:t xml:space="preserve"> </w:t>
+      </w:r>
+      <w:r>
+        <w:t xml:space="preserve">Mientras falte, la tarjeta</w:t>
+      </w:r>
+      <w:r>
+        <w:t xml:space="preserve"> </w:t>
+      </w:r>
+      <w:r>
+        <w:t xml:space="preserve">dice</w:t>
+      </w:r>
+      <w:r>
+        <w:t xml:space="preserve"> </w:t>
+      </w:r>
+      <w:r>
+        <w:rPr>
+          <w:i/>
+          <w:iCs/>
+        </w:rPr>
         <w:t xml:space="preserve">“</w:t>
       </w:r>
       <w:r>
+        <w:rPr>
+          <w:i/>
+          <w:iCs/>
+        </w:rPr>
+        <w:t xml:space="preserve">Paga $X antes del lavado: lo realizamos cuando el pago esté confirmado</w:t>
+      </w:r>
+      <w:r>
+        <w:rPr>
+          <w:i/>
+          <w:iCs/>
+        </w:rPr>
+        <w:t xml:space="preserve">”</w:t>
+      </w:r>
+      <w:r>
+        <w:t xml:space="preserve"> </w:t>
+      </w:r>
+      <w:r>
+        <w:t xml:space="preserve">y el</w:t>
+      </w:r>
+      <w:r>
+        <w:t xml:space="preserve"> </w:t>
+      </w:r>
+      <w:r>
+        <w:t xml:space="preserve">lavador no puede empezar. Un comprobante</w:t>
+      </w:r>
+      <w:r>
+        <w:t xml:space="preserve"> </w:t>
+      </w:r>
+      <w:r>
+        <w:t xml:space="preserve">“</w:t>
+      </w:r>
+      <w:r>
         <w:t xml:space="preserve">en verificación</w:t>
       </w:r>
       <w:r>
@@ -2314,62 +2756,13 @@
         <w:t xml:space="preserve"> </w:t>
       </w:r>
       <w:r>
-        <w:t xml:space="preserve">hasta que el operador lo aprueba.</w:t>
-      </w:r>
-    </w:p>
-    <w:p>
-      <w:pPr>
-        <w:pStyle w:val="FirstParagraph"/>
-      </w:pPr>
-      <w:r>
-        <w:t xml:space="preserve">El comprobante es</w:t>
-      </w:r>
-      <w:r>
-        <w:t xml:space="preserve"> </w:t>
-      </w:r>
-      <w:r>
-        <w:rPr>
-          <w:b/>
-          <w:bCs/>
-        </w:rPr>
-        <w:t xml:space="preserve">un solo archivo</w:t>
-      </w:r>
-      <w:r>
-        <w:t xml:space="preserve"> </w:t>
-      </w:r>
-      <w:r>
-        <w:t xml:space="preserve">de hasta</w:t>
-      </w:r>
-      <w:r>
-        <w:t xml:space="preserve"> </w:t>
-      </w:r>
-      <w:r>
-        <w:rPr>
-          <w:b/>
-          <w:bCs/>
-        </w:rPr>
-        <w:t xml:space="preserve">5 MB</w:t>
-      </w:r>
-      <w:r>
-        <w:t xml:space="preserve">: imagen (JPG, PNG, WEBP o</w:t>
-      </w:r>
-      <w:r>
-        <w:t xml:space="preserve"> </w:t>
-      </w:r>
-      <w:r>
-        <w:t xml:space="preserve">GIF) o PDF. Si el operador no puede validarlo, la reserva avisa que el comprobante</w:t>
-      </w:r>
-      <w:r>
-        <w:t xml:space="preserve"> </w:t>
-      </w:r>
-      <w:r>
-        <w:t xml:space="preserve">fue rechazado y puede enviar otro. También se puede pagar en efectivo al lavador;</w:t>
-      </w:r>
-      <w:r>
-        <w:t xml:space="preserve"> </w:t>
-      </w:r>
-      <w:r>
-        <w:t xml:space="preserve">el operador lo registra.</w:t>
+        <w:t xml:space="preserve">todavía no cuenta: tiene</w:t>
+      </w:r>
+      <w:r>
+        <w:t xml:space="preserve"> </w:t>
+      </w:r>
+      <w:r>
+        <w:t xml:space="preserve">que aprobarlo el operador, así que pague con tiempo, idealmente apenas reserve.</w:t>
       </w:r>
     </w:p>
     <w:p>
@@ -2377,75 +2770,7 @@
         <w:pStyle w:val="BodyText"/>
       </w:pPr>
       <w:r>
-        <w:t xml:space="preserve">El pago con tarjeta todavía no está disponible: la pasarela de pagos no está conectada.</w:t>
-      </w:r>
-    </w:p>
-    <w:bookmarkEnd w:id="56"/>
-    <w:bookmarkStart w:id="57" w:name="cancelar"/>
-    <w:p>
-      <w:pPr>
-        <w:pStyle w:val="Heading3"/>
-      </w:pPr>
-      <w:r>
-        <w:rPr>
-          <w:rStyle w:val="SectionNumber"/>
-        </w:rPr>
-        <w:t xml:space="preserve">0.4.2</w:t>
-      </w:r>
-      <w:r>
-        <w:tab/>
-      </w:r>
-      <w:r>
-        <w:t xml:space="preserve">4.2 Cancelar</w:t>
-      </w:r>
-    </w:p>
-    <w:p>
-      <w:pPr>
-        <w:pStyle w:val="FirstParagraph"/>
-      </w:pPr>
-      <w:r>
-        <w:t xml:space="preserve">Toque</w:t>
-      </w:r>
-      <w:r>
-        <w:t xml:space="preserve"> </w:t>
-      </w:r>
-      <w:r>
-        <w:rPr>
-          <w:b/>
-          <w:bCs/>
-        </w:rPr>
-        <w:t xml:space="preserve">Cancelar</w:t>
-      </w:r>
-      <w:r>
-        <w:t xml:space="preserve"> </w:t>
-      </w:r>
-      <w:r>
-        <w:t xml:space="preserve">en la reserva y confirme. Solo se puede mientras está</w:t>
-      </w:r>
-      <w:r>
-        <w:t xml:space="preserve"> </w:t>
-      </w:r>
-      <w:r>
-        <w:t xml:space="preserve">solicitada o confirmada; una vez iniciado el lavado ya no.</w:t>
-      </w:r>
-    </w:p>
-    <w:bookmarkEnd w:id="57"/>
-    <w:bookmarkStart w:id="58" w:name="ver-la-evidencia-y-descargar-el-acta"/>
-    <w:p>
-      <w:pPr>
-        <w:pStyle w:val="Heading3"/>
-      </w:pPr>
-      <w:r>
-        <w:rPr>
-          <w:rStyle w:val="SectionNumber"/>
-        </w:rPr>
-        <w:t xml:space="preserve">0.4.3</w:t>
-      </w:r>
-      <w:r>
-        <w:tab/>
-      </w:r>
-      <w:r>
-        <w:t xml:space="preserve">4.3 Ver la evidencia y descargar el acta</w:t>
+        <w:t xml:space="preserve">Lo que sale en $0 (por su plan VIP o el plan de su edificio) no necesita pago.</w:t>
       </w:r>
     </w:p>
     <w:p>
@@ -2457,17 +2782,7 @@
         </w:numPr>
       </w:pPr>
       <w:r>
-        <w:rPr>
-          <w:b/>
-          <w:bCs/>
-        </w:rPr>
-        <w:t xml:space="preserve">Evidencia:</w:t>
-      </w:r>
-      <w:r>
-        <w:t xml:space="preserve"> </w:t>
-      </w:r>
-      <w:r>
-        <w:t xml:space="preserve">fotos de antes y después que subió el lavador.</w:t>
+        <w:t xml:space="preserve">Transfiera el total a la cuenta que le indique la empresa.</w:t>
       </w:r>
     </w:p>
     <w:p>
@@ -2479,6 +2794,242 @@
         </w:numPr>
       </w:pPr>
       <w:r>
+        <w:t xml:space="preserve">En la reserva toque</w:t>
+      </w:r>
+      <w:r>
+        <w:t xml:space="preserve"> </w:t>
+      </w:r>
+      <w:r>
+        <w:rPr>
+          <w:b/>
+          <w:bCs/>
+        </w:rPr>
+        <w:t xml:space="preserve">Pagar</w:t>
+      </w:r>
+      <w:r>
+        <w:t xml:space="preserve"> </w:t>
+      </w:r>
+      <w:r>
+        <w:t xml:space="preserve">y adjunte el comprobante, el monto y, si lo tiene, el número de transferencia.</w:t>
+      </w:r>
+    </w:p>
+    <w:p>
+      <w:pPr>
+        <w:pStyle w:val="Compact"/>
+        <w:numPr>
+          <w:ilvl w:val="0"/>
+          <w:numId w:val="1008"/>
+        </w:numPr>
+      </w:pPr>
+      <w:r>
+        <w:t xml:space="preserve">Toque</w:t>
+      </w:r>
+      <w:r>
+        <w:t xml:space="preserve"> </w:t>
+      </w:r>
+      <w:r>
+        <w:rPr>
+          <w:b/>
+          <w:bCs/>
+        </w:rPr>
+        <w:t xml:space="preserve">Enviar comprobante</w:t>
+      </w:r>
+      <w:r>
+        <w:t xml:space="preserve">. La tarjeta muestra</w:t>
+      </w:r>
+      <w:r>
+        <w:t xml:space="preserve"> </w:t>
+      </w:r>
+      <w:r>
+        <w:t xml:space="preserve">“</w:t>
+      </w:r>
+      <w:r>
+        <w:t xml:space="preserve">en verificación</w:t>
+      </w:r>
+      <w:r>
+        <w:t xml:space="preserve">”</w:t>
+      </w:r>
+      <w:r>
+        <w:t xml:space="preserve"> </w:t>
+      </w:r>
+      <w:r>
+        <w:t xml:space="preserve">hasta que el operador lo aprueba.</w:t>
+      </w:r>
+    </w:p>
+    <w:p>
+      <w:pPr>
+        <w:pStyle w:val="FirstParagraph"/>
+      </w:pPr>
+      <w:r>
+        <w:t xml:space="preserve">El comprobante es</w:t>
+      </w:r>
+      <w:r>
+        <w:t xml:space="preserve"> </w:t>
+      </w:r>
+      <w:r>
+        <w:rPr>
+          <w:b/>
+          <w:bCs/>
+        </w:rPr>
+        <w:t xml:space="preserve">un solo archivo</w:t>
+      </w:r>
+      <w:r>
+        <w:t xml:space="preserve"> </w:t>
+      </w:r>
+      <w:r>
+        <w:t xml:space="preserve">de hasta</w:t>
+      </w:r>
+      <w:r>
+        <w:t xml:space="preserve"> </w:t>
+      </w:r>
+      <w:r>
+        <w:rPr>
+          <w:b/>
+          <w:bCs/>
+        </w:rPr>
+        <w:t xml:space="preserve">5 MB</w:t>
+      </w:r>
+      <w:r>
+        <w:t xml:space="preserve">: imagen (JPG, PNG, WEBP o</w:t>
+      </w:r>
+      <w:r>
+        <w:t xml:space="preserve"> </w:t>
+      </w:r>
+      <w:r>
+        <w:t xml:space="preserve">GIF) o PDF. Si el operador no puede validarlo, la reserva avisa que el comprobante</w:t>
+      </w:r>
+      <w:r>
+        <w:t xml:space="preserve"> </w:t>
+      </w:r>
+      <w:r>
+        <w:t xml:space="preserve">fue rechazado y puede enviar otro. También se puede pagar en efectivo en la</w:t>
+      </w:r>
+      <w:r>
+        <w:t xml:space="preserve"> </w:t>
+      </w:r>
+      <w:r>
+        <w:t xml:space="preserve">oficina o al operador, que lo registra antes de que empiece el lavado.</w:t>
+      </w:r>
+    </w:p>
+    <w:p>
+      <w:pPr>
+        <w:pStyle w:val="BodyText"/>
+      </w:pPr>
+      <w:r>
+        <w:t xml:space="preserve">El pago con tarjeta todavía no está disponible: la pasarela de pagos no está conectada.</w:t>
+      </w:r>
+    </w:p>
+    <w:bookmarkEnd w:id="57"/>
+    <w:bookmarkStart w:id="58" w:name="cancelar"/>
+    <w:p>
+      <w:pPr>
+        <w:pStyle w:val="Heading3"/>
+      </w:pPr>
+      <w:r>
+        <w:rPr>
+          <w:rStyle w:val="SectionNumber"/>
+        </w:rPr>
+        <w:t xml:space="preserve">0.4.2</w:t>
+      </w:r>
+      <w:r>
+        <w:tab/>
+      </w:r>
+      <w:r>
+        <w:t xml:space="preserve">4.2 Cancelar</w:t>
+      </w:r>
+    </w:p>
+    <w:p>
+      <w:pPr>
+        <w:pStyle w:val="FirstParagraph"/>
+      </w:pPr>
+      <w:r>
+        <w:t xml:space="preserve">Toque</w:t>
+      </w:r>
+      <w:r>
+        <w:t xml:space="preserve"> </w:t>
+      </w:r>
+      <w:r>
+        <w:rPr>
+          <w:b/>
+          <w:bCs/>
+        </w:rPr>
+        <w:t xml:space="preserve">Cancelar</w:t>
+      </w:r>
+      <w:r>
+        <w:t xml:space="preserve"> </w:t>
+      </w:r>
+      <w:r>
+        <w:t xml:space="preserve">en la reserva y confirme. Solo se puede mientras está</w:t>
+      </w:r>
+      <w:r>
+        <w:t xml:space="preserve"> </w:t>
+      </w:r>
+      <w:r>
+        <w:t xml:space="preserve">solicitada o confirmada; una vez iniciado el lavado ya no. Si ya había pagado,</w:t>
+      </w:r>
+      <w:r>
+        <w:t xml:space="preserve"> </w:t>
+      </w:r>
+      <w:r>
+        <w:t xml:space="preserve">pida la devolución al operador con el código de la reserva. Si era un lavado</w:t>
+      </w:r>
+      <w:r>
+        <w:t xml:space="preserve"> </w:t>
+      </w:r>
+      <w:r>
+        <w:t xml:space="preserve">incluido en su plan VIP, el lavado vuelve a su cupo del mes.</w:t>
+      </w:r>
+    </w:p>
+    <w:bookmarkEnd w:id="58"/>
+    <w:bookmarkStart w:id="59" w:name="ver-la-evidencia-y-descargar-el-acta"/>
+    <w:p>
+      <w:pPr>
+        <w:pStyle w:val="Heading3"/>
+      </w:pPr>
+      <w:r>
+        <w:rPr>
+          <w:rStyle w:val="SectionNumber"/>
+        </w:rPr>
+        <w:t xml:space="preserve">0.4.3</w:t>
+      </w:r>
+      <w:r>
+        <w:tab/>
+      </w:r>
+      <w:r>
+        <w:t xml:space="preserve">4.3 Ver la evidencia y descargar el acta</w:t>
+      </w:r>
+    </w:p>
+    <w:p>
+      <w:pPr>
+        <w:pStyle w:val="Compact"/>
+        <w:numPr>
+          <w:ilvl w:val="0"/>
+          <w:numId w:val="1009"/>
+        </w:numPr>
+      </w:pPr>
+      <w:r>
+        <w:rPr>
+          <w:b/>
+          <w:bCs/>
+        </w:rPr>
+        <w:t xml:space="preserve">Evidencia:</w:t>
+      </w:r>
+      <w:r>
+        <w:t xml:space="preserve"> </w:t>
+      </w:r>
+      <w:r>
+        <w:t xml:space="preserve">fotos de antes y después que subió el lavador.</w:t>
+      </w:r>
+    </w:p>
+    <w:p>
+      <w:pPr>
+        <w:pStyle w:val="Compact"/>
+        <w:numPr>
+          <w:ilvl w:val="0"/>
+          <w:numId w:val="1009"/>
+        </w:numPr>
+      </w:pPr>
+      <w:r>
         <w:rPr>
           <w:b/>
           <w:bCs/>
@@ -2492,8 +3043,8 @@
         <w:t xml:space="preserve">PDF con los datos del servicio, las fotos, los pagos y la calificación. En la app Android se abre el menú de compartir para guardarla o enviarla.</w:t>
       </w:r>
     </w:p>
-    <w:bookmarkEnd w:id="58"/>
-    <w:bookmarkStart w:id="59" w:name="calificar"/>
+    <w:bookmarkEnd w:id="59"/>
+    <w:bookmarkStart w:id="60" w:name="calificar"/>
     <w:p>
       <w:pPr>
         <w:pStyle w:val="Heading3"/>
@@ -2538,9 +3089,550 @@
         <w:t xml:space="preserve">y, si quiere, deje un comentario. Cada reserva se califica una sola vez.</w:t>
       </w:r>
     </w:p>
-    <w:bookmarkEnd w:id="59"/>
     <w:bookmarkEnd w:id="60"/>
-    <w:bookmarkStart w:id="64" w:name="lavador-mis-trabajos"/>
+    <w:bookmarkStart w:id="61" w:name="plan-vip-personas"/>
+    <w:p>
+      <w:pPr>
+        <w:pStyle w:val="Heading3"/>
+      </w:pPr>
+      <w:r>
+        <w:rPr>
+          <w:rStyle w:val="SectionNumber"/>
+        </w:rPr>
+        <w:t xml:space="preserve">0.4.5</w:t>
+      </w:r>
+      <w:r>
+        <w:tab/>
+      </w:r>
+      <w:r>
+        <w:t xml:space="preserve">4.5 Plan VIP (personas)</w:t>
+      </w:r>
+    </w:p>
+    <w:p>
+      <w:pPr>
+        <w:pStyle w:val="FirstParagraph"/>
+      </w:pPr>
+      <w:r>
+        <w:t xml:space="preserve">Un plan VIP se paga cada mes y da, según el plan:</w:t>
+      </w:r>
+    </w:p>
+    <w:p>
+      <w:pPr>
+        <w:pStyle w:val="Compact"/>
+        <w:numPr>
+          <w:ilvl w:val="0"/>
+          <w:numId w:val="1010"/>
+        </w:numPr>
+      </w:pPr>
+      <w:r>
+        <w:rPr>
+          <w:b/>
+          <w:bCs/>
+        </w:rPr>
+        <w:t xml:space="preserve">Lavados incluidos al mes</w:t>
+      </w:r>
+      <w:r>
+        <w:t xml:space="preserve">, que salen en $0.</w:t>
+      </w:r>
+    </w:p>
+    <w:p>
+      <w:pPr>
+        <w:pStyle w:val="Compact"/>
+        <w:numPr>
+          <w:ilvl w:val="0"/>
+          <w:numId w:val="1010"/>
+        </w:numPr>
+      </w:pPr>
+      <w:r>
+        <w:rPr>
+          <w:b/>
+          <w:bCs/>
+        </w:rPr>
+        <w:t xml:space="preserve">Descuento</w:t>
+      </w:r>
+      <w:r>
+        <w:t xml:space="preserve"> </w:t>
+      </w:r>
+      <w:r>
+        <w:t xml:space="preserve">en los lavados que pasen de ese número y en los adicionales.</w:t>
+      </w:r>
+    </w:p>
+    <w:p>
+      <w:pPr>
+        <w:pStyle w:val="Compact"/>
+        <w:numPr>
+          <w:ilvl w:val="0"/>
+          <w:numId w:val="1010"/>
+        </w:numPr>
+      </w:pPr>
+      <w:r>
+        <w:rPr>
+          <w:b/>
+          <w:bCs/>
+        </w:rPr>
+        <w:t xml:space="preserve">Prioridad:</w:t>
+      </w:r>
+      <w:r>
+        <w:t xml:space="preserve"> </w:t>
+      </w:r>
+      <w:r>
+        <w:t xml:space="preserve">reservar con más días de anticipación y, si la empresa lo activa, horarios apartados para VIP.</w:t>
+      </w:r>
+    </w:p>
+    <w:p>
+      <w:pPr>
+        <w:pStyle w:val="FirstParagraph"/>
+      </w:pPr>
+      <w:r>
+        <w:t xml:space="preserve">Para suscribirse:</w:t>
+      </w:r>
+    </w:p>
+    <w:p>
+      <w:pPr>
+        <w:pStyle w:val="Compact"/>
+        <w:numPr>
+          <w:ilvl w:val="0"/>
+          <w:numId w:val="1011"/>
+        </w:numPr>
+      </w:pPr>
+      <w:r>
+        <w:t xml:space="preserve">En el menú abra</w:t>
+      </w:r>
+      <w:r>
+        <w:t xml:space="preserve"> </w:t>
+      </w:r>
+      <w:r>
+        <w:rPr>
+          <w:b/>
+          <w:bCs/>
+        </w:rPr>
+        <w:t xml:space="preserve">Mi plan VIP</w:t>
+      </w:r>
+      <w:r>
+        <w:t xml:space="preserve">, elija un plan y toque</w:t>
+      </w:r>
+      <w:r>
+        <w:t xml:space="preserve"> </w:t>
+      </w:r>
+      <w:r>
+        <w:rPr>
+          <w:b/>
+          <w:bCs/>
+        </w:rPr>
+        <w:t xml:space="preserve">Quiero este plan</w:t>
+      </w:r>
+      <w:r>
+        <w:t xml:space="preserve">.</w:t>
+      </w:r>
+    </w:p>
+    <w:p>
+      <w:pPr>
+        <w:pStyle w:val="Compact"/>
+        <w:numPr>
+          <w:ilvl w:val="0"/>
+          <w:numId w:val="1011"/>
+        </w:numPr>
+      </w:pPr>
+      <w:r>
+        <w:t xml:space="preserve">Transfiera el valor del mes y, en</w:t>
+      </w:r>
+      <w:r>
+        <w:t xml:space="preserve"> </w:t>
+      </w:r>
+      <w:r>
+        <w:rPr>
+          <w:b/>
+          <w:bCs/>
+        </w:rPr>
+        <w:t xml:space="preserve">Mensualidades</w:t>
+      </w:r>
+      <w:r>
+        <w:t xml:space="preserve">, toque</w:t>
+      </w:r>
+      <w:r>
+        <w:t xml:space="preserve"> </w:t>
+      </w:r>
+      <w:r>
+        <w:rPr>
+          <w:b/>
+          <w:bCs/>
+        </w:rPr>
+        <w:t xml:space="preserve">Subir comprobante</w:t>
+      </w:r>
+      <w:r>
+        <w:t xml:space="preserve">.</w:t>
+      </w:r>
+    </w:p>
+    <w:p>
+      <w:pPr>
+        <w:pStyle w:val="Compact"/>
+        <w:numPr>
+          <w:ilvl w:val="0"/>
+          <w:numId w:val="1011"/>
+        </w:numPr>
+      </w:pPr>
+      <w:r>
+        <w:t xml:space="preserve">Cuando el operador aprueba el pago, el plan aparece</w:t>
+      </w:r>
+      <w:r>
+        <w:t xml:space="preserve"> </w:t>
+      </w:r>
+      <w:r>
+        <w:rPr>
+          <w:b/>
+          <w:bCs/>
+        </w:rPr>
+        <w:t xml:space="preserve">activo este mes</w:t>
+      </w:r>
+      <w:r>
+        <w:t xml:space="preserve">.</w:t>
+      </w:r>
+    </w:p>
+    <w:p>
+      <w:pPr>
+        <w:pStyle w:val="FirstParagraph"/>
+      </w:pPr>
+      <w:r>
+        <w:rPr>
+          <w:b/>
+          <w:bCs/>
+        </w:rPr>
+        <w:t xml:space="preserve">Los beneficios rigen solo en los meses pagados.</w:t>
+      </w:r>
+      <w:r>
+        <w:t xml:space="preserve"> </w:t>
+      </w:r>
+      <w:r>
+        <w:t xml:space="preserve">Cada mes aparece una nueva</w:t>
+      </w:r>
+      <w:r>
+        <w:t xml:space="preserve"> </w:t>
+      </w:r>
+      <w:r>
+        <w:t xml:space="preserve">mensualidad pendiente; mientras no esté aprobada, el plan dice</w:t>
+      </w:r>
+      <w:r>
+        <w:t xml:space="preserve"> </w:t>
+      </w:r>
+      <w:r>
+        <w:t xml:space="preserve">“</w:t>
+      </w:r>
+      <w:r>
+        <w:t xml:space="preserve">sin pagar este mes</w:t>
+      </w:r>
+      <w:r>
+        <w:t xml:space="preserve">”</w:t>
+      </w:r>
+      <w:r>
+        <w:t xml:space="preserve"> </w:t>
+      </w:r>
+      <w:r>
+        <w:t xml:space="preserve">y las reservas de ese mes se cobran a precio normal. En la misma pantalla se ve</w:t>
+      </w:r>
+      <w:r>
+        <w:t xml:space="preserve"> </w:t>
+      </w:r>
+      <w:r>
+        <w:t xml:space="preserve">cuántos lavados le quedan del mes; el cupo se reinicia el día 1.</w:t>
+      </w:r>
+    </w:p>
+    <w:p>
+      <w:pPr>
+        <w:pStyle w:val="BodyText"/>
+      </w:pPr>
+      <w:r>
+        <w:rPr>
+          <w:b/>
+          <w:bCs/>
+        </w:rPr>
+        <w:t xml:space="preserve">Cancelar mi plan:</w:t>
+      </w:r>
+      <w:r>
+        <w:t xml:space="preserve"> </w:t>
+      </w:r>
+      <w:r>
+        <w:t xml:space="preserve">lo ya pagado del mes se respeta; desde el mes siguiente deja</w:t>
+      </w:r>
+      <w:r>
+        <w:t xml:space="preserve"> </w:t>
+      </w:r>
+      <w:r>
+        <w:t xml:space="preserve">de cobrarse. Las cuentas de empresa no tienen plan VIP.</w:t>
+      </w:r>
+    </w:p>
+    <w:bookmarkEnd w:id="61"/>
+    <w:bookmarkStart w:id="62" w:name="cuentas-de-empresa"/>
+    <w:p>
+      <w:pPr>
+        <w:pStyle w:val="Heading3"/>
+      </w:pPr>
+      <w:r>
+        <w:rPr>
+          <w:rStyle w:val="SectionNumber"/>
+        </w:rPr>
+        <w:t xml:space="preserve">0.4.6</w:t>
+      </w:r>
+      <w:r>
+        <w:tab/>
+      </w:r>
+      <w:r>
+        <w:t xml:space="preserve">4.6 Cuentas de empresa</w:t>
+      </w:r>
+    </w:p>
+    <w:p>
+      <w:pPr>
+        <w:pStyle w:val="FirstParagraph"/>
+      </w:pPr>
+      <w:r>
+        <w:t xml:space="preserve">Si su cuenta es de una empresa, la crea el administrador y la maneja una sola</w:t>
+      </w:r>
+      <w:r>
+        <w:t xml:space="preserve"> </w:t>
+      </w:r>
+      <w:r>
+        <w:t xml:space="preserve">persona (el gestor de la flota). Reserva igual que una persona (sección 3), con</w:t>
+      </w:r>
+      <w:r>
+        <w:t xml:space="preserve"> </w:t>
+      </w:r>
+      <w:r>
+        <w:t xml:space="preserve">estas diferencias:</w:t>
+      </w:r>
+    </w:p>
+    <w:p>
+      <w:pPr>
+        <w:pStyle w:val="Compact"/>
+        <w:numPr>
+          <w:ilvl w:val="0"/>
+          <w:numId w:val="1012"/>
+        </w:numPr>
+      </w:pPr>
+      <w:r>
+        <w:rPr>
+          <w:b/>
+          <w:bCs/>
+        </w:rPr>
+        <w:t xml:space="preserve">No paga al reservar.</w:t>
+      </w:r>
+      <w:r>
+        <w:t xml:space="preserve"> </w:t>
+      </w:r>
+      <w:r>
+        <w:t xml:space="preserve">El boleto dice</w:t>
+      </w:r>
+      <w:r>
+        <w:t xml:space="preserve"> </w:t>
+      </w:r>
+      <w:r>
+        <w:t xml:space="preserve">“</w:t>
+      </w:r>
+      <w:r>
+        <w:t xml:space="preserve">A crédito, con la tarifa de tu empresa</w:t>
+      </w:r>
+      <w:r>
+        <w:t xml:space="preserve">”</w:t>
+      </w:r>
+      <w:r>
+        <w:t xml:space="preserve">. Todo se factura en el</w:t>
+      </w:r>
+      <w:r>
+        <w:t xml:space="preserve"> </w:t>
+      </w:r>
+      <w:r>
+        <w:rPr>
+          <w:b/>
+          <w:bCs/>
+        </w:rPr>
+        <w:t xml:space="preserve">corte mensual</w:t>
+      </w:r>
+      <w:r>
+        <w:t xml:space="preserve">.</w:t>
+      </w:r>
+    </w:p>
+    <w:p>
+      <w:pPr>
+        <w:pStyle w:val="Compact"/>
+        <w:numPr>
+          <w:ilvl w:val="0"/>
+          <w:numId w:val="1012"/>
+        </w:numPr>
+      </w:pPr>
+      <w:r>
+        <w:rPr>
+          <w:b/>
+          <w:bCs/>
+        </w:rPr>
+        <w:t xml:space="preserve">Precios pactados:</w:t>
+      </w:r>
+      <w:r>
+        <w:t xml:space="preserve"> </w:t>
+      </w:r>
+      <w:r>
+        <w:t xml:space="preserve">se ven los de su empresa, no los de lista.</w:t>
+      </w:r>
+    </w:p>
+    <w:p>
+      <w:pPr>
+        <w:pStyle w:val="Compact"/>
+        <w:numPr>
+          <w:ilvl w:val="0"/>
+          <w:numId w:val="1012"/>
+        </w:numPr>
+      </w:pPr>
+      <w:r>
+        <w:t xml:space="preserve">Si su empresa tiene</w:t>
+      </w:r>
+      <w:r>
+        <w:t xml:space="preserve"> </w:t>
+      </w:r>
+      <w:r>
+        <w:rPr>
+          <w:b/>
+          <w:bCs/>
+        </w:rPr>
+        <w:t xml:space="preserve">parqueadero propio</w:t>
+      </w:r>
+      <w:r>
+        <w:t xml:space="preserve">, aparece en el paso Lugar como</w:t>
+      </w:r>
+      <w:r>
+        <w:t xml:space="preserve"> </w:t>
+      </w:r>
+      <w:r>
+        <w:t xml:space="preserve">“</w:t>
+      </w:r>
+      <w:r>
+        <w:t xml:space="preserve">Parqueadero de tu empresa</w:t>
+      </w:r>
+      <w:r>
+        <w:t xml:space="preserve">”</w:t>
+      </w:r>
+      <w:r>
+        <w:t xml:space="preserve">.</w:t>
+      </w:r>
+    </w:p>
+    <w:p>
+      <w:pPr>
+        <w:pStyle w:val="FirstParagraph"/>
+      </w:pPr>
+      <w:r>
+        <w:t xml:space="preserve">En</w:t>
+      </w:r>
+      <w:r>
+        <w:t xml:space="preserve"> </w:t>
+      </w:r>
+      <w:r>
+        <w:rPr>
+          <w:b/>
+          <w:bCs/>
+        </w:rPr>
+        <w:t xml:space="preserve">Mi flota</w:t>
+      </w:r>
+      <w:r>
+        <w:t xml:space="preserve"> </w:t>
+      </w:r>
+      <w:r>
+        <w:t xml:space="preserve">el gestor ve:</w:t>
+      </w:r>
+    </w:p>
+    <w:p>
+      <w:pPr>
+        <w:pStyle w:val="Compact"/>
+        <w:numPr>
+          <w:ilvl w:val="0"/>
+          <w:numId w:val="1013"/>
+        </w:numPr>
+      </w:pPr>
+      <w:r>
+        <w:rPr>
+          <w:b/>
+          <w:bCs/>
+        </w:rPr>
+        <w:t xml:space="preserve">Gasto del mes</w:t>
+      </w:r>
+      <w:r>
+        <w:t xml:space="preserve"> </w:t>
+      </w:r>
+      <w:r>
+        <w:t xml:space="preserve">(lavados completados, a su tarifa) y lo</w:t>
+      </w:r>
+      <w:r>
+        <w:t xml:space="preserve"> </w:t>
+      </w:r>
+      <w:r>
+        <w:rPr>
+          <w:b/>
+          <w:bCs/>
+        </w:rPr>
+        <w:t xml:space="preserve">pendiente de facturar</w:t>
+      </w:r>
+      <w:r>
+        <w:t xml:space="preserve">.</w:t>
+      </w:r>
+    </w:p>
+    <w:p>
+      <w:pPr>
+        <w:pStyle w:val="Compact"/>
+        <w:numPr>
+          <w:ilvl w:val="0"/>
+          <w:numId w:val="1013"/>
+        </w:numPr>
+      </w:pPr>
+      <w:r>
+        <w:rPr>
+          <w:b/>
+          <w:bCs/>
+        </w:rPr>
+        <w:t xml:space="preserve">Por vehículo:</w:t>
+      </w:r>
+      <w:r>
+        <w:t xml:space="preserve"> </w:t>
+      </w:r>
+      <w:r>
+        <w:t xml:space="preserve">cuántos lavados tuvo cada uno en el mes, con flechas para ver meses anteriores.</w:t>
+      </w:r>
+    </w:p>
+    <w:p>
+      <w:pPr>
+        <w:pStyle w:val="Compact"/>
+        <w:numPr>
+          <w:ilvl w:val="0"/>
+          <w:numId w:val="1013"/>
+        </w:numPr>
+      </w:pPr>
+      <w:r>
+        <w:rPr>
+          <w:b/>
+          <w:bCs/>
+        </w:rPr>
+        <w:t xml:space="preserve">Cortes mensuales:</w:t>
+      </w:r>
+      <w:r>
+        <w:t xml:space="preserve"> </w:t>
+      </w:r>
+      <w:r>
+        <w:t xml:space="preserve">cada factura con su estado (cerrado, facturado, pagado), el número de factura y el botón</w:t>
+      </w:r>
+      <w:r>
+        <w:t xml:space="preserve"> </w:t>
+      </w:r>
+      <w:r>
+        <w:rPr>
+          <w:b/>
+          <w:bCs/>
+        </w:rPr>
+        <w:t xml:space="preserve">Excel</w:t>
+      </w:r>
+      <w:r>
+        <w:t xml:space="preserve"> </w:t>
+      </w:r>
+      <w:r>
+        <w:t xml:space="preserve">con el detalle lavado por lavado.</w:t>
+      </w:r>
+    </w:p>
+    <w:bookmarkEnd w:id="62"/>
+    <w:bookmarkEnd w:id="63"/>
+    <w:bookmarkStart w:id="68" w:name="lavador-mis-trabajos"/>
     <w:p>
       <w:pPr>
         <w:pStyle w:val="Heading2"/>
@@ -2603,18 +3695,18 @@
           <wp:inline>
             <wp:extent cx="5334000" cy="3122341"/>
             <wp:effectExtent b="0" l="0" r="0" t="0"/>
-            <wp:docPr descr="Figura 10" title="" id="62" name="Picture"/>
+            <wp:docPr descr="Figura 10" title="" id="65" name="Picture"/>
             <a:graphic>
               <a:graphicData uri="http://schemas.openxmlformats.org/drawingml/2006/picture">
                 <pic:pic>
                   <pic:nvPicPr>
-                    <pic:cNvPr descr="img/fig10-mis-trabajos.png" id="63" name="Picture"/>
+                    <pic:cNvPr descr="img/fig10-mis-trabajos.png" id="66" name="Picture"/>
                     <pic:cNvPicPr>
                       <a:picLocks noChangeArrowheads="1" noChangeAspect="1"/>
                     </pic:cNvPicPr>
                   </pic:nvPicPr>
                   <pic:blipFill>
-                    <a:blip r:embed="rId61"/>
+                    <a:blip r:embed="rId64"/>
                     <a:stretch>
                       <a:fillRect/>
                     </a:stretch>
@@ -2719,7 +3811,7 @@
         <w:pStyle w:val="Compact"/>
         <w:numPr>
           <w:ilvl w:val="0"/>
-          <w:numId w:val="1009"/>
+          <w:numId w:val="1014"/>
         </w:numPr>
       </w:pPr>
       <w:r>
@@ -2760,7 +3852,7 @@
         <w:pStyle w:val="Compact"/>
         <w:numPr>
           <w:ilvl w:val="0"/>
-          <w:numId w:val="1009"/>
+          <w:numId w:val="1014"/>
         </w:numPr>
       </w:pPr>
       <w:r>
@@ -2803,7 +3895,7 @@
         <w:pStyle w:val="Compact"/>
         <w:numPr>
           <w:ilvl w:val="0"/>
-          <w:numId w:val="1009"/>
+          <w:numId w:val="1014"/>
         </w:numPr>
       </w:pPr>
       <w:r>
@@ -2828,7 +3920,7 @@
         <w:pStyle w:val="Compact"/>
         <w:numPr>
           <w:ilvl w:val="0"/>
-          <w:numId w:val="1009"/>
+          <w:numId w:val="1014"/>
         </w:numPr>
       </w:pPr>
       <w:r>
@@ -2853,7 +3945,7 @@
         <w:pStyle w:val="Compact"/>
         <w:numPr>
           <w:ilvl w:val="0"/>
-          <w:numId w:val="1009"/>
+          <w:numId w:val="1014"/>
         </w:numPr>
       </w:pPr>
       <w:r>
@@ -2910,7 +4002,78 @@
         <w:t xml:space="preserve"> </w:t>
       </w:r>
       <w:r>
-        <w:t xml:space="preserve">está en proceso. Si un trabajo no aparece o el cliente no está, avise al operador:</w:t>
+        <w:t xml:space="preserve">está en proceso.</w:t>
+      </w:r>
+    </w:p>
+    <w:p>
+      <w:pPr>
+        <w:pStyle w:val="BodyText"/>
+      </w:pPr>
+      <w:r>
+        <w:rPr>
+          <w:b/>
+          <w:bCs/>
+        </w:rPr>
+        <w:t xml:space="preserve">No inicie un lavado sin pagar.</w:t>
+      </w:r>
+      <w:r>
+        <w:t xml:space="preserve"> </w:t>
+      </w:r>
+      <w:r>
+        <w:t xml:space="preserve">Si la tarjeta dice</w:t>
+      </w:r>
+      <w:r>
+        <w:t xml:space="preserve"> </w:t>
+      </w:r>
+      <w:r>
+        <w:rPr>
+          <w:i/>
+          <w:iCs/>
+        </w:rPr>
+        <w:t xml:space="preserve">“</w:t>
+      </w:r>
+      <w:r>
+        <w:rPr>
+          <w:i/>
+          <w:iCs/>
+        </w:rPr>
+        <w:t xml:space="preserve">Falta el pago de $X: el</w:t>
+      </w:r>
+      <w:r>
+        <w:rPr>
+          <w:i/>
+          <w:iCs/>
+        </w:rPr>
+        <w:t xml:space="preserve"> </w:t>
+      </w:r>
+      <w:r>
+        <w:rPr>
+          <w:i/>
+          <w:iCs/>
+        </w:rPr>
+        <w:t xml:space="preserve">lavado se paga antes de hacerlo</w:t>
+      </w:r>
+      <w:r>
+        <w:rPr>
+          <w:i/>
+          <w:iCs/>
+        </w:rPr>
+        <w:t xml:space="preserve">”</w:t>
+      </w:r>
+      <w:r>
+        <w:t xml:space="preserve">, el sistema no lo deja iniciar. Pida al cliente</w:t>
+      </w:r>
+      <w:r>
+        <w:t xml:space="preserve"> </w:t>
+      </w:r>
+      <w:r>
+        <w:t xml:space="preserve">que pague (o avise al operador para que registre el efectivo). Las reservas de</w:t>
+      </w:r>
+      <w:r>
+        <w:t xml:space="preserve"> </w:t>
+      </w:r>
+      <w:r>
+        <w:t xml:space="preserve">empresas no muestran este aviso: van a crédito. Si un trabajo no aparece o el cliente no está, avise al operador:</w:t>
       </w:r>
       <w:r>
         <w:t xml:space="preserve"> </w:t>
@@ -2943,8 +4106,340 @@
         <w:t xml:space="preserve">del día para saber qué más está programado.</w:t>
       </w:r>
     </w:p>
-    <w:bookmarkEnd w:id="64"/>
-    <w:bookmarkStart w:id="77" w:name="operador-y-administrador-el-día-a-día"/>
+    <w:bookmarkStart w:id="67" w:name="equipo-a-domicilio"/>
+    <w:p>
+      <w:pPr>
+        <w:pStyle w:val="Heading3"/>
+      </w:pPr>
+      <w:r>
+        <w:rPr>
+          <w:rStyle w:val="SectionNumber"/>
+        </w:rPr>
+        <w:t xml:space="preserve">0.5.1</w:t>
+      </w:r>
+      <w:r>
+        <w:tab/>
+      </w:r>
+      <w:r>
+        <w:t xml:space="preserve">5.1 Equipo a domicilio</w:t>
+      </w:r>
+    </w:p>
+    <w:p>
+      <w:pPr>
+        <w:pStyle w:val="FirstParagraph"/>
+      </w:pPr>
+      <w:r>
+        <w:t xml:space="preserve">Las reservas a domicilio traen la dirección, la referencia, quién recibe y su</w:t>
+      </w:r>
+      <w:r>
+        <w:t xml:space="preserve"> </w:t>
+      </w:r>
+      <w:r>
+        <w:t xml:space="preserve">teléfono, y estos botones:</w:t>
+      </w:r>
+    </w:p>
+    <w:tbl>
+      <w:tblPr>
+        <w:tblStyle w:val="Table"/>
+        <w:tblW w:type="pct" w:w="5000"/>
+        <w:jc w:val="left"/>
+        <w:tblLayout w:type="fixed"/>
+        <w:tblLook w:firstRow="1" w:lastRow="0" w:firstColumn="0" w:lastColumn="0" w:noHBand="0" w:noVBand="0" w:val="0020"/>
+      </w:tblPr>
+      <w:tblGrid>
+        <w:gridCol w:w="2640"/>
+        <w:gridCol w:w="2640"/>
+        <w:gridCol w:w="2640"/>
+      </w:tblGrid>
+      <w:tr>
+        <w:trPr>
+          <w:tblHeader w:val="on"/>
+        </w:trPr>
+        <w:tc>
+          <w:tcPr/>
+          <w:p>
+            <w:pPr>
+              <w:pStyle w:val="Compact"/>
+              <w:jc w:val="left"/>
+            </w:pPr>
+            <w:r>
+              <w:t xml:space="preserve">Botón</w:t>
+            </w:r>
+          </w:p>
+        </w:tc>
+        <w:tc>
+          <w:tcPr/>
+          <w:p>
+            <w:pPr>
+              <w:pStyle w:val="Compact"/>
+              <w:jc w:val="left"/>
+            </w:pPr>
+            <w:r>
+              <w:t xml:space="preserve">Cuándo</w:t>
+            </w:r>
+          </w:p>
+        </w:tc>
+        <w:tc>
+          <w:tcPr/>
+          <w:p>
+            <w:pPr>
+              <w:pStyle w:val="Compact"/>
+              <w:jc w:val="left"/>
+            </w:pPr>
+            <w:r>
+              <w:t xml:space="preserve">Qué hace</w:t>
+            </w:r>
+          </w:p>
+        </w:tc>
+      </w:tr>
+      <w:tr>
+        <w:tc>
+          <w:tcPr/>
+          <w:p>
+            <w:pPr>
+              <w:pStyle w:val="Compact"/>
+              <w:jc w:val="left"/>
+            </w:pPr>
+            <w:r>
+              <w:t xml:space="preserve">Mapa</w:t>
+            </w:r>
+          </w:p>
+        </w:tc>
+        <w:tc>
+          <w:tcPr/>
+          <w:p>
+            <w:pPr>
+              <w:pStyle w:val="Compact"/>
+              <w:jc w:val="left"/>
+            </w:pPr>
+            <w:r>
+              <w:t xml:space="preserve">Siempre</w:t>
+            </w:r>
+          </w:p>
+        </w:tc>
+        <w:tc>
+          <w:tcPr/>
+          <w:p>
+            <w:pPr>
+              <w:pStyle w:val="Compact"/>
+              <w:jc w:val="left"/>
+            </w:pPr>
+            <w:r>
+              <w:t xml:space="preserve">Abre la dirección en el mapa del celular</w:t>
+            </w:r>
+          </w:p>
+        </w:tc>
+      </w:tr>
+      <w:tr>
+        <w:tc>
+          <w:tcPr/>
+          <w:p>
+            <w:pPr>
+              <w:pStyle w:val="Compact"/>
+              <w:jc w:val="left"/>
+            </w:pPr>
+            <w:r>
+              <w:t xml:space="preserve">Salí</w:t>
+            </w:r>
+          </w:p>
+        </w:tc>
+        <w:tc>
+          <w:tcPr/>
+          <w:p>
+            <w:pPr>
+              <w:pStyle w:val="Compact"/>
+              <w:jc w:val="left"/>
+            </w:pPr>
+            <w:r>
+              <w:t xml:space="preserve">Al salir hacia la dirección</w:t>
+            </w:r>
+          </w:p>
+        </w:tc>
+        <w:tc>
+          <w:tcPr/>
+          <w:p>
+            <w:pPr>
+              <w:pStyle w:val="Compact"/>
+              <w:jc w:val="left"/>
+            </w:pPr>
+            <w:r>
+              <w:t xml:space="preserve">Avisa al cliente que el equipo va en camino. No se puede si falta el pago</w:t>
+            </w:r>
+          </w:p>
+        </w:tc>
+      </w:tr>
+      <w:tr>
+        <w:tc>
+          <w:tcPr/>
+          <w:p>
+            <w:pPr>
+              <w:pStyle w:val="Compact"/>
+              <w:jc w:val="left"/>
+            </w:pPr>
+            <w:r>
+              <w:t xml:space="preserve">Llegué</w:t>
+            </w:r>
+          </w:p>
+        </w:tc>
+        <w:tc>
+          <w:tcPr/>
+          <w:p>
+            <w:pPr>
+              <w:pStyle w:val="Compact"/>
+              <w:jc w:val="left"/>
+            </w:pPr>
+            <w:r>
+              <w:t xml:space="preserve">Al llegar</w:t>
+            </w:r>
+          </w:p>
+        </w:tc>
+        <w:tc>
+          <w:tcPr/>
+          <w:p>
+            <w:pPr>
+              <w:pStyle w:val="Compact"/>
+              <w:jc w:val="left"/>
+            </w:pPr>
+            <w:r>
+              <w:t xml:space="preserve">Registra la llegada (con la ubicación del celular, si la da)</w:t>
+            </w:r>
+          </w:p>
+        </w:tc>
+      </w:tr>
+      <w:tr>
+        <w:tc>
+          <w:tcPr/>
+          <w:p>
+            <w:pPr>
+              <w:pStyle w:val="Compact"/>
+              <w:jc w:val="left"/>
+            </w:pPr>
+            <w:r>
+              <w:t xml:space="preserve">No se pudo lavar</w:t>
+            </w:r>
+          </w:p>
+        </w:tc>
+        <w:tc>
+          <w:tcPr/>
+          <w:p>
+            <w:pPr>
+              <w:pStyle w:val="Compact"/>
+              <w:jc w:val="left"/>
+            </w:pPr>
+            <w:r>
+              <w:t xml:space="preserve">Si no se puede hacer el trabajo</w:t>
+            </w:r>
+          </w:p>
+        </w:tc>
+        <w:tc>
+          <w:tcPr/>
+          <w:p>
+            <w:pPr>
+              <w:pStyle w:val="Compact"/>
+              <w:jc w:val="left"/>
+            </w:pPr>
+            <w:r>
+              <w:t xml:space="preserve">Pide el motivo y cierra la visita como fallida</w:t>
+            </w:r>
+          </w:p>
+        </w:tc>
+      </w:tr>
+    </w:tbl>
+    <w:p>
+      <w:pPr>
+        <w:pStyle w:val="BodyText"/>
+      </w:pPr>
+      <w:r>
+        <w:t xml:space="preserve">Para</w:t>
+      </w:r>
+      <w:r>
+        <w:t xml:space="preserve"> </w:t>
+      </w:r>
+      <w:r>
+        <w:rPr>
+          <w:b/>
+          <w:bCs/>
+        </w:rPr>
+        <w:t xml:space="preserve">No se pudo lavar</w:t>
+      </w:r>
+      <w:r>
+        <w:t xml:space="preserve">, escriba el número de un motivo de la lista (no había</w:t>
+      </w:r>
+      <w:r>
+        <w:t xml:space="preserve"> </w:t>
+      </w:r>
+      <w:r>
+        <w:t xml:space="preserve">acceso al lugar, no había toma de agua o de luz, el vehículo no estaba, el cliente</w:t>
+      </w:r>
+      <w:r>
+        <w:t xml:space="preserve"> </w:t>
+      </w:r>
+      <w:r>
+        <w:t xml:space="preserve">canceló en el sitio, lluvia) o escriba otro, y confirme. La visita fallida se cobra al cliente. Después de</w:t>
+      </w:r>
+      <w:r>
+        <w:t xml:space="preserve"> </w:t>
+      </w:r>
+      <w:r>
+        <w:rPr>
+          <w:b/>
+          <w:bCs/>
+        </w:rPr>
+        <w:t xml:space="preserve">Llegué</w:t>
+      </w:r>
+      <w:r>
+        <w:t xml:space="preserve">, el trabajo</w:t>
+      </w:r>
+      <w:r>
+        <w:t xml:space="preserve"> </w:t>
+      </w:r>
+      <w:r>
+        <w:t xml:space="preserve">sigue como cualquier otro: fotos,</w:t>
+      </w:r>
+      <w:r>
+        <w:t xml:space="preserve"> </w:t>
+      </w:r>
+      <w:r>
+        <w:rPr>
+          <w:b/>
+          <w:bCs/>
+        </w:rPr>
+        <w:t xml:space="preserve">Iniciar</w:t>
+      </w:r>
+      <w:r>
+        <w:t xml:space="preserve">, descripción y</w:t>
+      </w:r>
+      <w:r>
+        <w:t xml:space="preserve"> </w:t>
+      </w:r>
+      <w:r>
+        <w:rPr>
+          <w:b/>
+          <w:bCs/>
+        </w:rPr>
+        <w:t xml:space="preserve">Completar</w:t>
+      </w:r>
+      <w:r>
+        <w:t xml:space="preserve">.</w:t>
+      </w:r>
+    </w:p>
+    <w:p>
+      <w:pPr>
+        <w:pStyle w:val="BodyText"/>
+      </w:pPr>
+      <w:r>
+        <w:t xml:space="preserve">En la web, la ubicación del celular todavía no se registra (el navegador la exige</w:t>
+      </w:r>
+      <w:r>
+        <w:t xml:space="preserve"> </w:t>
+      </w:r>
+      <w:r>
+        <w:t xml:space="preserve">con conexión segura HTTPS); la llegada queda registrada sin GPS.</w:t>
+      </w:r>
+    </w:p>
+    <w:bookmarkEnd w:id="67"/>
+    <w:bookmarkEnd w:id="68"/>
+    <w:bookmarkStart w:id="81" w:name="operador-y-administrador-el-día-a-día"/>
     <w:p>
       <w:pPr>
         <w:pStyle w:val="Heading2"/>
@@ -2976,7 +4471,83 @@
         <w:t xml:space="preserve">los pagos. Todo se hace desde el menú de la izquierda (☰ en el celular).</w:t>
       </w:r>
     </w:p>
-    <w:bookmarkStart w:id="65" w:name="dashboard"/>
+    <w:p>
+      <w:pPr>
+        <w:pStyle w:val="BodyText"/>
+      </w:pPr>
+      <w:r>
+        <w:rPr>
+          <w:b/>
+          <w:bCs/>
+        </w:rPr>
+        <w:t xml:space="preserve">Ciudades.</w:t>
+      </w:r>
+      <w:r>
+        <w:t xml:space="preserve"> </w:t>
+      </w:r>
+      <w:r>
+        <w:t xml:space="preserve">Un operador con ciudad asignada ve y maneja solo lo de su ciudad. El</w:t>
+      </w:r>
+      <w:r>
+        <w:t xml:space="preserve"> </w:t>
+      </w:r>
+      <w:r>
+        <w:t xml:space="preserve">operador nacional y el administrador ven todo el país y tienen arriba el selector</w:t>
+      </w:r>
+      <w:r>
+        <w:t xml:space="preserve"> </w:t>
+      </w:r>
+      <w:r>
+        <w:rPr>
+          <w:b/>
+          <w:bCs/>
+        </w:rPr>
+        <w:t xml:space="preserve">Todo el país / ciudad</w:t>
+      </w:r>
+      <w:r>
+        <w:t xml:space="preserve"> </w:t>
+      </w:r>
+      <w:r>
+        <w:t xml:space="preserve">para mirar una sola. Todo lo de ciudades, empresas,</w:t>
+      </w:r>
+      <w:r>
+        <w:t xml:space="preserve"> </w:t>
+      </w:r>
+      <w:r>
+        <w:t xml:space="preserve">lavado a domicilio, planes VIP y la regla de pago se configura según el</w:t>
+      </w:r>
+      <w:r>
+        <w:t xml:space="preserve"> </w:t>
+      </w:r>
+      <w:r>
+        <w:rPr>
+          <w:b/>
+          <w:bCs/>
+        </w:rPr>
+        <w:t xml:space="preserve">Manual</w:t>
+      </w:r>
+      <w:r>
+        <w:rPr>
+          <w:b/>
+          <w:bCs/>
+        </w:rPr>
+        <w:t xml:space="preserve"> </w:t>
+      </w:r>
+      <w:r>
+        <w:rPr>
+          <w:b/>
+          <w:bCs/>
+        </w:rPr>
+        <w:t xml:space="preserve">de administrador</w:t>
+      </w:r>
+      <w:r>
+        <w:t xml:space="preserve"> </w:t>
+      </w:r>
+      <w:r>
+        <w:t xml:space="preserve">(secciones 1.2 a 1.6).</w:t>
+      </w:r>
+    </w:p>
+    <w:bookmarkStart w:id="69" w:name="dashboard"/>
     <w:p>
       <w:pPr>
         <w:pStyle w:val="Heading3"/>
@@ -3069,7 +4640,7 @@
         <w:pStyle w:val="Compact"/>
         <w:numPr>
           <w:ilvl w:val="0"/>
-          <w:numId w:val="1010"/>
+          <w:numId w:val="1015"/>
         </w:numPr>
       </w:pPr>
       <w:r>
@@ -3091,7 +4662,7 @@
         <w:pStyle w:val="Compact"/>
         <w:numPr>
           <w:ilvl w:val="0"/>
-          <w:numId w:val="1010"/>
+          <w:numId w:val="1015"/>
         </w:numPr>
       </w:pPr>
       <w:r>
@@ -3152,8 +4723,8 @@
         <w:t xml:space="preserve">(sección 6.6). El Dashboard siempre muestra el presente.</w:t>
       </w:r>
     </w:p>
-    <w:bookmarkEnd w:id="65"/>
-    <w:bookmarkStart w:id="66" w:name="agenda"/>
+    <w:bookmarkEnd w:id="69"/>
+    <w:bookmarkStart w:id="70" w:name="agenda"/>
     <w:p>
       <w:pPr>
         <w:pStyle w:val="Heading3"/>
@@ -3201,7 +4772,13 @@
         <w:t xml:space="preserve">Bloquear franja manualmente</w:t>
       </w:r>
       <w:r>
-        <w:t xml:space="preserve">: indique inicio, fin y motivo, y</w:t>
+        <w:t xml:space="preserve">: elija dónde (un sitio, toda la</w:t>
+      </w:r>
+      <w:r>
+        <w:t xml:space="preserve"> </w:t>
+      </w:r>
+      <w:r>
+        <w:t xml:space="preserve">ciudad o, para el alcance nacional, todo el país), indique inicio, fin y motivo, y</w:t>
       </w:r>
       <w:r>
         <w:t xml:space="preserve"> </w:t>
@@ -3220,11 +4797,17 @@
         <w:t xml:space="preserve">Bloquear</w:t>
       </w:r>
       <w:r>
-        <w:t xml:space="preserve">. Ese horario deja de ofrecerse a los clientes en todos los sitios.</w:t>
-      </w:r>
-    </w:p>
-    <w:bookmarkEnd w:id="66"/>
-    <w:bookmarkStart w:id="70" w:name="reservas"/>
+        <w:t xml:space="preserve">. Ese horario deja de ofrecerse solo donde se bloqueó; cada</w:t>
+      </w:r>
+      <w:r>
+        <w:t xml:space="preserve"> </w:t>
+      </w:r>
+      <w:r>
+        <w:t xml:space="preserve">bloqueo de la lista dice su alcance. Bloquear todo el país pide confirmación.</w:t>
+      </w:r>
+    </w:p>
+    <w:bookmarkEnd w:id="70"/>
+    <w:bookmarkStart w:id="74" w:name="reservas"/>
     <w:p>
       <w:pPr>
         <w:pStyle w:val="Heading3"/>
@@ -3265,18 +4848,18 @@
           <wp:inline>
             <wp:extent cx="5334000" cy="1718125"/>
             <wp:effectExtent b="0" l="0" r="0" t="0"/>
-            <wp:docPr descr="Figura 11" title="" id="68" name="Picture"/>
+            <wp:docPr descr="Figura 11" title="" id="72" name="Picture"/>
             <a:graphic>
               <a:graphicData uri="http://schemas.openxmlformats.org/drawingml/2006/picture">
                 <pic:pic>
                   <pic:nvPicPr>
-                    <pic:cNvPr descr="img/fig11-reservas-panel.png" id="69" name="Picture"/>
+                    <pic:cNvPr descr="img/fig11-reservas-panel.png" id="73" name="Picture"/>
                     <pic:cNvPicPr>
                       <a:picLocks noChangeArrowheads="1" noChangeAspect="1"/>
                     </pic:cNvPicPr>
                   </pic:nvPicPr>
                   <pic:blipFill>
-                    <a:blip r:embed="rId67"/>
+                    <a:blip r:embed="rId71"/>
                     <a:stretch>
                       <a:fillRect/>
                     </a:stretch>
@@ -3655,6 +5238,90 @@
         <w:pStyle w:val="BodyText"/>
       </w:pPr>
       <w:r>
+        <w:t xml:space="preserve">La columna de pago dice</w:t>
+      </w:r>
+      <w:r>
+        <w:t xml:space="preserve"> </w:t>
+      </w:r>
+      <w:r>
+        <w:rPr>
+          <w:b/>
+          <w:bCs/>
+        </w:rPr>
+        <w:t xml:space="preserve">sin pagar</w:t>
+      </w:r>
+      <w:r>
+        <w:t xml:space="preserve">,</w:t>
+      </w:r>
+      <w:r>
+        <w:t xml:space="preserve"> </w:t>
+      </w:r>
+      <w:r>
+        <w:rPr>
+          <w:b/>
+          <w:bCs/>
+        </w:rPr>
+        <w:t xml:space="preserve">pagado $X</w:t>
+      </w:r>
+      <w:r>
+        <w:t xml:space="preserve"> </w:t>
+      </w:r>
+      <w:r>
+        <w:t xml:space="preserve">o</w:t>
+      </w:r>
+      <w:r>
+        <w:t xml:space="preserve"> </w:t>
+      </w:r>
+      <w:r>
+        <w:rPr>
+          <w:b/>
+          <w:bCs/>
+        </w:rPr>
+        <w:t xml:space="preserve">✓ pagado</w:t>
+      </w:r>
+      <w:r>
+        <w:t xml:space="preserve">. Con la regla</w:t>
+      </w:r>
+      <w:r>
+        <w:t xml:space="preserve"> </w:t>
+      </w:r>
+      <w:r>
+        <w:t xml:space="preserve">de pago anticipado,</w:t>
+      </w:r>
+      <w:r>
+        <w:t xml:space="preserve"> </w:t>
+      </w:r>
+      <w:r>
+        <w:rPr>
+          <w:b/>
+          <w:bCs/>
+        </w:rPr>
+        <w:t xml:space="preserve">Iniciar</w:t>
+      </w:r>
+      <w:r>
+        <w:t xml:space="preserve"> </w:t>
+      </w:r>
+      <w:r>
+        <w:t xml:space="preserve">se rechaza mientras quede saldo: registre el</w:t>
+      </w:r>
+      <w:r>
+        <w:t xml:space="preserve"> </w:t>
+      </w:r>
+      <w:r>
+        <w:t xml:space="preserve">efectivo o apruebe el comprobante primero. Las reservas de empresas (a crédito)</w:t>
+      </w:r>
+      <w:r>
+        <w:t xml:space="preserve"> </w:t>
+      </w:r>
+      <w:r>
+        <w:t xml:space="preserve">no tienen esa exigencia.</w:t>
+      </w:r>
+    </w:p>
+    <w:p>
+      <w:pPr>
+        <w:pStyle w:val="BodyText"/>
+      </w:pPr>
+      <w:r>
         <w:t xml:space="preserve">El estado</w:t>
       </w:r>
       <w:r>
@@ -3682,8 +5349,8 @@
         <w:t xml:space="preserve">marcarlo: si el cliente no está, cancele la reserva.</w:t>
       </w:r>
     </w:p>
-    <w:bookmarkEnd w:id="70"/>
-    <w:bookmarkStart w:id="71" w:name="nueva-reserva-para-un-cliente"/>
+    <w:bookmarkEnd w:id="74"/>
+    <w:bookmarkStart w:id="75" w:name="nueva-reserva-para-un-cliente"/>
     <w:p>
       <w:pPr>
         <w:pStyle w:val="Heading3"/>
@@ -3732,10 +5399,48 @@
           <w:b/>
           <w:bCs/>
         </w:rPr>
-        <w:t xml:space="preserve">Nueva reserva</w:t>
-      </w:r>
-      <w:r>
-        <w:t xml:space="preserve">.</w:t>
+        <w:t xml:space="preserve">Nueva</w:t>
+      </w:r>
+      <w:r>
+        <w:rPr>
+          <w:b/>
+          <w:bCs/>
+        </w:rPr>
+        <w:t xml:space="preserve"> </w:t>
+      </w:r>
+      <w:r>
+        <w:rPr>
+          <w:b/>
+          <w:bCs/>
+        </w:rPr>
+        <w:t xml:space="preserve">reserva</w:t>
+      </w:r>
+      <w:r>
+        <w:t xml:space="preserve">. Es la única forma de que el personal reserve: el menú</w:t>
+      </w:r>
+      <w:r>
+        <w:t xml:space="preserve"> </w:t>
+      </w:r>
+      <w:r>
+        <w:t xml:space="preserve">“</w:t>
+      </w:r>
+      <w:r>
+        <w:t xml:space="preserve">Nueva Reserva</w:t>
+      </w:r>
+      <w:r>
+        <w:t xml:space="preserve">”</w:t>
+      </w:r>
+      <w:r>
+        <w:t xml:space="preserve"> </w:t>
+      </w:r>
+      <w:r>
+        <w:t xml:space="preserve">es</w:t>
+      </w:r>
+      <w:r>
+        <w:t xml:space="preserve"> </w:t>
+      </w:r>
+      <w:r>
+        <w:t xml:space="preserve">solo para clientes.</w:t>
       </w:r>
     </w:p>
     <w:p>
@@ -3743,7 +5448,7 @@
         <w:pStyle w:val="Compact"/>
         <w:numPr>
           <w:ilvl w:val="0"/>
-          <w:numId w:val="1011"/>
+          <w:numId w:val="1016"/>
         </w:numPr>
       </w:pPr>
       <w:r>
@@ -3768,7 +5473,7 @@
         <w:pStyle w:val="Compact"/>
         <w:numPr>
           <w:ilvl w:val="0"/>
-          <w:numId w:val="1011"/>
+          <w:numId w:val="1016"/>
         </w:numPr>
       </w:pPr>
       <w:r>
@@ -3780,11 +5485,24 @@
         <w:pStyle w:val="Compact"/>
         <w:numPr>
           <w:ilvl w:val="0"/>
-          <w:numId w:val="1011"/>
+          <w:numId w:val="1016"/>
         </w:numPr>
       </w:pPr>
       <w:r>
-        <w:t xml:space="preserve">Elija el servicio (cada uno muestra el precio para ese tipo de vehículo), los adicionales, el estacionamiento y la fecha.</w:t>
+        <w:t xml:space="preserve">Elija el servicio (cada uno muestra el precio para ese tipo de vehículo), los adicionales, el estacionamiento —o</w:t>
+      </w:r>
+      <w:r>
+        <w:t xml:space="preserve"> </w:t>
+      </w:r>
+      <w:r>
+        <w:rPr>
+          <w:b/>
+          <w:bCs/>
+        </w:rPr>
+        <w:t xml:space="preserve">a domicilio</w:t>
+      </w:r>
+      <w:r>
+        <w:t xml:space="preserve">, con sector y dirección— y la fecha.</w:t>
       </w:r>
     </w:p>
     <w:p>
@@ -3792,7 +5510,7 @@
         <w:pStyle w:val="Compact"/>
         <w:numPr>
           <w:ilvl w:val="0"/>
-          <w:numId w:val="1011"/>
+          <w:numId w:val="1016"/>
         </w:numPr>
       </w:pPr>
       <w:r>
@@ -3812,8 +5530,8 @@
         <w:t xml:space="preserve">. Se muestra el código y el total.</w:t>
       </w:r>
     </w:p>
-    <w:bookmarkEnd w:id="71"/>
-    <w:bookmarkStart w:id="75" w:name="pagos-por-verificar"/>
+    <w:bookmarkEnd w:id="75"/>
+    <w:bookmarkStart w:id="79" w:name="pagos-por-verificar"/>
     <w:p>
       <w:pPr>
         <w:pStyle w:val="Heading3"/>
@@ -3836,13 +5554,29 @@
         <w:pStyle w:val="FirstParagraph"/>
       </w:pPr>
       <w:r>
-        <w:t xml:space="preserve">Aquí llegan los comprobantes que envían los clientes; el menú muestra cuántos hay</w:t>
-      </w:r>
-      <w:r>
-        <w:t xml:space="preserve"> </w:t>
-      </w:r>
-      <w:r>
-        <w:t xml:space="preserve">pendientes. Revise la imagen o el PDF contra la cuenta bancaria y toque</w:t>
+        <w:t xml:space="preserve">Aquí llegan los comprobantes que envían los clientes, de reservas y de</w:t>
+      </w:r>
+      <w:r>
+        <w:t xml:space="preserve"> </w:t>
+      </w:r>
+      <w:r>
+        <w:t xml:space="preserve">mensualidades VIP; el menú muestra cuántos hay pendientes.</w:t>
+      </w:r>
+      <w:r>
+        <w:t xml:space="preserve"> </w:t>
+      </w:r>
+      <w:r>
+        <w:rPr>
+          <w:b/>
+          <w:bCs/>
+        </w:rPr>
+        <w:t xml:space="preserve">Revíselos pronto:</w:t>
+      </w:r>
+      <w:r>
+        <w:t xml:space="preserve"> </w:t>
+      </w:r>
+      <w:r>
+        <w:t xml:space="preserve">como el lavado se paga antes, un comprobante sin aprobar detiene el trabajo. Revise la imagen o el PDF contra la cuenta bancaria y toque</w:t>
       </w:r>
       <w:r>
         <w:t xml:space="preserve"> </w:t>
@@ -3906,18 +5640,18 @@
           <wp:inline>
             <wp:extent cx="5334000" cy="1952415"/>
             <wp:effectExtent b="0" l="0" r="0" t="0"/>
-            <wp:docPr descr="Figura 12" title="" id="73" name="Picture"/>
+            <wp:docPr descr="Figura 12" title="" id="77" name="Picture"/>
             <a:graphic>
               <a:graphicData uri="http://schemas.openxmlformats.org/drawingml/2006/picture">
                 <pic:pic>
                   <pic:nvPicPr>
-                    <pic:cNvPr descr="img/fig12-pagos-por-verificar.png" id="74" name="Picture"/>
+                    <pic:cNvPr descr="img/fig12-pagos-por-verificar.png" id="78" name="Picture"/>
                     <pic:cNvPicPr>
                       <a:picLocks noChangeArrowheads="1" noChangeAspect="1"/>
                     </pic:cNvPicPr>
                   </pic:nvPicPr>
                   <pic:blipFill>
-                    <a:blip r:embed="rId72"/>
+                    <a:blip r:embed="rId76"/>
                     <a:stretch>
                       <a:fillRect/>
                     </a:stretch>
@@ -3964,8 +5698,8 @@
         <w:t xml:space="preserve">Figura 12 — Pagos por verificar.</w:t>
       </w:r>
     </w:p>
-    <w:bookmarkEnd w:id="75"/>
-    <w:bookmarkStart w:id="76" w:name="reportes"/>
+    <w:bookmarkEnd w:id="79"/>
+    <w:bookmarkStart w:id="80" w:name="reportes"/>
     <w:p>
       <w:pPr>
         <w:pStyle w:val="Heading3"/>
@@ -4101,7 +5835,7 @@
         <w:pStyle w:val="Compact"/>
         <w:numPr>
           <w:ilvl w:val="0"/>
-          <w:numId w:val="1012"/>
+          <w:numId w:val="1017"/>
         </w:numPr>
       </w:pPr>
       <w:r>
@@ -4139,7 +5873,7 @@
         <w:pStyle w:val="Compact"/>
         <w:numPr>
           <w:ilvl w:val="0"/>
-          <w:numId w:val="1012"/>
+          <w:numId w:val="1017"/>
         </w:numPr>
       </w:pPr>
       <w:r>
@@ -4306,9 +6040,9 @@
         <w:t xml:space="preserve">).</w:t>
       </w:r>
     </w:p>
-    <w:bookmarkEnd w:id="76"/>
-    <w:bookmarkEnd w:id="77"/>
-    <w:bookmarkStart w:id="89" w:name="administrador-catálogo-y-configuración"/>
+    <w:bookmarkEnd w:id="80"/>
+    <w:bookmarkEnd w:id="81"/>
+    <w:bookmarkStart w:id="93" w:name="administrador-catálogo-y-configuración"/>
     <w:p>
       <w:pPr>
         <w:pStyle w:val="Heading2"/>
@@ -4366,7 +6100,7 @@
         <w:t xml:space="preserve">, y así las reservas y los reportes anteriores quedan intactos.</w:t>
       </w:r>
     </w:p>
-    <w:bookmarkStart w:id="81" w:name="servicios-y-precios"/>
+    <w:bookmarkStart w:id="85" w:name="servicios-y-precios"/>
     <w:p>
       <w:pPr>
         <w:pStyle w:val="Heading3"/>
@@ -4397,7 +6131,7 @@
         <w:pStyle w:val="Compact"/>
         <w:numPr>
           <w:ilvl w:val="0"/>
-          <w:numId w:val="1013"/>
+          <w:numId w:val="1018"/>
         </w:numPr>
       </w:pPr>
       <w:r>
@@ -4435,7 +6169,7 @@
         <w:pStyle w:val="Compact"/>
         <w:numPr>
           <w:ilvl w:val="0"/>
-          <w:numId w:val="1013"/>
+          <w:numId w:val="1018"/>
         </w:numPr>
       </w:pPr>
       <w:r>
@@ -4447,7 +6181,7 @@
         <w:pStyle w:val="Compact"/>
         <w:numPr>
           <w:ilvl w:val="0"/>
-          <w:numId w:val="1013"/>
+          <w:numId w:val="1018"/>
         </w:numPr>
       </w:pPr>
       <w:r>
@@ -4476,18 +6210,18 @@
           <wp:inline>
             <wp:extent cx="5334000" cy="3201961"/>
             <wp:effectExtent b="0" l="0" r="0" t="0"/>
-            <wp:docPr descr="Figura 13" title="" id="79" name="Picture"/>
+            <wp:docPr descr="Figura 13" title="" id="83" name="Picture"/>
             <a:graphic>
               <a:graphicData uri="http://schemas.openxmlformats.org/drawingml/2006/picture">
                 <pic:pic>
                   <pic:nvPicPr>
-                    <pic:cNvPr descr="img/fig13-servicios-precios.png" id="80" name="Picture"/>
+                    <pic:cNvPr descr="img/fig13-servicios-precios.png" id="84" name="Picture"/>
                     <pic:cNvPicPr>
                       <a:picLocks noChangeArrowheads="1" noChangeAspect="1"/>
                     </pic:cNvPicPr>
                   </pic:nvPicPr>
                   <pic:blipFill>
-                    <a:blip r:embed="rId78"/>
+                    <a:blip r:embed="rId82"/>
                     <a:stretch>
                       <a:fillRect/>
                     </a:stretch>
@@ -4599,8 +6333,8 @@
         <w:t xml:space="preserve">que no pueden reservar hasta que se carguen.</w:t>
       </w:r>
     </w:p>
-    <w:bookmarkEnd w:id="81"/>
-    <w:bookmarkStart w:id="82" w:name="adicionales"/>
+    <w:bookmarkEnd w:id="85"/>
+    <w:bookmarkStart w:id="86" w:name="adicionales"/>
     <w:p>
       <w:pPr>
         <w:pStyle w:val="Heading3"/>
@@ -4672,8 +6406,8 @@
         <w:t xml:space="preserve">los cubren.</w:t>
       </w:r>
     </w:p>
-    <w:bookmarkEnd w:id="82"/>
-    <w:bookmarkStart w:id="83" w:name="tipos-de-vehículo"/>
+    <w:bookmarkEnd w:id="86"/>
+    <w:bookmarkStart w:id="87" w:name="tipos-de-vehículo"/>
     <w:p>
       <w:pPr>
         <w:pStyle w:val="Heading3"/>
@@ -4733,8 +6467,8 @@
         <w:t xml:space="preserve">reservar con los existentes.</w:t>
       </w:r>
     </w:p>
-    <w:bookmarkEnd w:id="83"/>
-    <w:bookmarkStart w:id="84" w:name="clientes"/>
+    <w:bookmarkEnd w:id="87"/>
+    <w:bookmarkStart w:id="88" w:name="clientes"/>
     <w:p>
       <w:pPr>
         <w:pStyle w:val="Heading3"/>
@@ -4807,8 +6541,8 @@
         <w:t xml:space="preserve">cliente le impide ingresar y reservar.</w:t>
       </w:r>
     </w:p>
-    <w:bookmarkEnd w:id="84"/>
-    <w:bookmarkStart w:id="85" w:name="lavadores"/>
+    <w:bookmarkEnd w:id="88"/>
+    <w:bookmarkStart w:id="89" w:name="lavadores"/>
     <w:p>
       <w:pPr>
         <w:pStyle w:val="Heading3"/>
@@ -4844,6 +6578,19 @@
         <w:t xml:space="preserve">Nuevo lavador</w:t>
       </w:r>
       <w:r>
+        <w:t xml:space="preserve">, su</w:t>
+      </w:r>
+      <w:r>
+        <w:t xml:space="preserve"> </w:t>
+      </w:r>
+      <w:r>
+        <w:rPr>
+          <w:b/>
+          <w:bCs/>
+        </w:rPr>
+        <w:t xml:space="preserve">ciudad</w:t>
+      </w:r>
+      <w:r>
         <w:t xml:space="preserve"> </w:t>
       </w:r>
       <w:r>
@@ -4863,23 +6610,39 @@
         <w:t xml:space="preserve"> </w:t>
       </w:r>
       <w:r>
-        <w:t xml:space="preserve">para que vea Mis</w:t>
-      </w:r>
-      <w:r>
-        <w:t xml:space="preserve"> </w:t>
-      </w:r>
-      <w:r>
-        <w:t xml:space="preserve">Trabajos. La cantidad de lavadores activos es la capacidad de servicios expreso en</w:t>
-      </w:r>
-      <w:r>
-        <w:t xml:space="preserve"> </w:t>
-      </w:r>
-      <w:r>
-        <w:t xml:space="preserve">los sitios que no tienen una capacidad propia.</w:t>
-      </w:r>
-    </w:p>
-    <w:bookmarkEnd w:id="85"/>
-    <w:bookmarkStart w:id="86" w:name="estacionamientos"/>
+        <w:t xml:space="preserve">para que vea Mis Trabajos. La cantidad de lavadores activos</w:t>
+      </w:r>
+      <w:r>
+        <w:t xml:space="preserve"> </w:t>
+      </w:r>
+      <w:r>
+        <w:rPr>
+          <w:b/>
+          <w:bCs/>
+        </w:rPr>
+        <w:t xml:space="preserve">de la ciudad</w:t>
+      </w:r>
+      <w:r>
+        <w:t xml:space="preserve"> </w:t>
+      </w:r>
+      <w:r>
+        <w:t xml:space="preserve">es la</w:t>
+      </w:r>
+      <w:r>
+        <w:t xml:space="preserve"> </w:t>
+      </w:r>
+      <w:r>
+        <w:t xml:space="preserve">capacidad de servicios expreso en los sitios que no tienen una capacidad propia. Los</w:t>
+      </w:r>
+      <w:r>
+        <w:t xml:space="preserve"> </w:t>
+      </w:r>
+      <w:r>
+        <w:t xml:space="preserve">lavadores que forman parte de un equipo a domicilio no cuentan para el expreso.</w:t>
+      </w:r>
+    </w:p>
+    <w:bookmarkEnd w:id="89"/>
+    <w:bookmarkStart w:id="90" w:name="estacionamientos"/>
     <w:p>
       <w:pPr>
         <w:pStyle w:val="Heading3"/>
@@ -4902,7 +6665,55 @@
         <w:pStyle w:val="FirstParagraph"/>
       </w:pPr>
       <w:r>
-        <w:t xml:space="preserve">Cada sitio tiene dirección, horario de apertura y cierre, y en</w:t>
+        <w:t xml:space="preserve">Cada sitio tiene ciudad, tipo (</w:t>
+      </w:r>
+      <w:r>
+        <w:rPr>
+          <w:b/>
+          <w:bCs/>
+        </w:rPr>
+        <w:t xml:space="preserve">aliado</w:t>
+      </w:r>
+      <w:r>
+        <w:t xml:space="preserve">: estacionamiento de edificio o</w:t>
+      </w:r>
+      <w:r>
+        <w:t xml:space="preserve"> </w:t>
+      </w:r>
+      <w:r>
+        <w:t xml:space="preserve">condominio;</w:t>
+      </w:r>
+      <w:r>
+        <w:t xml:space="preserve"> </w:t>
+      </w:r>
+      <w:r>
+        <w:rPr>
+          <w:b/>
+          <w:bCs/>
+        </w:rPr>
+        <w:t xml:space="preserve">taller</w:t>
+      </w:r>
+      <w:r>
+        <w:t xml:space="preserve">: bahías de limpieza profunda, uno por ciudad;</w:t>
+      </w:r>
+      <w:r>
+        <w:t xml:space="preserve"> </w:t>
+      </w:r>
+      <w:r>
+        <w:rPr>
+          <w:b/>
+          <w:bCs/>
+        </w:rPr>
+        <w:t xml:space="preserve">privado</w:t>
+      </w:r>
+      <w:r>
+        <w:t xml:space="preserve">: el</w:t>
+      </w:r>
+      <w:r>
+        <w:t xml:space="preserve"> </w:t>
+      </w:r>
+      <w:r>
+        <w:t xml:space="preserve">parqueadero propio de una empresa), dirección, horario de apertura y cierre, y en</w:t>
       </w:r>
       <w:r>
         <w:t xml:space="preserve"> </w:t>
@@ -4923,7 +6734,7 @@
         <w:pStyle w:val="Compact"/>
         <w:numPr>
           <w:ilvl w:val="0"/>
-          <w:numId w:val="1014"/>
+          <w:numId w:val="1019"/>
         </w:numPr>
       </w:pPr>
       <w:r>
@@ -4945,7 +6756,7 @@
         <w:pStyle w:val="Compact"/>
         <w:numPr>
           <w:ilvl w:val="0"/>
-          <w:numId w:val="1014"/>
+          <w:numId w:val="1019"/>
         </w:numPr>
       </w:pPr>
       <w:r>
@@ -4992,8 +6803,8 @@
         <w:t xml:space="preserve">disponibles son la capacidad de la limpieza profunda.</w:t>
       </w:r>
     </w:p>
-    <w:bookmarkEnd w:id="86"/>
-    <w:bookmarkStart w:id="87" w:name="planes-para-edificios"/>
+    <w:bookmarkEnd w:id="90"/>
+    <w:bookmarkStart w:id="91" w:name="planes-para-edificios-y-vip"/>
     <w:p>
       <w:pPr>
         <w:pStyle w:val="Heading3"/>
@@ -5008,7 +6819,7 @@
         <w:tab/>
       </w:r>
       <w:r>
-        <w:t xml:space="preserve">7.7 Planes para edificios</w:t>
+        <w:t xml:space="preserve">7.7 Planes para edificios y VIP</w:t>
       </w:r>
     </w:p>
     <w:p>
@@ -5037,8 +6848,57 @@
         <w:t xml:space="preserve">sitio sale en $0. El cupo se reinicia el día 1 de cada mes.</w:t>
       </w:r>
     </w:p>
-    <w:bookmarkEnd w:id="87"/>
-    <w:bookmarkStart w:id="88" w:name="reportes-1"/>
+    <w:p>
+      <w:pPr>
+        <w:pStyle w:val="BodyText"/>
+      </w:pPr>
+      <w:r>
+        <w:t xml:space="preserve">Los</w:t>
+      </w:r>
+      <w:r>
+        <w:t xml:space="preserve"> </w:t>
+      </w:r>
+      <w:r>
+        <w:rPr>
+          <w:b/>
+          <w:bCs/>
+        </w:rPr>
+        <w:t xml:space="preserve">planes VIP</w:t>
+      </w:r>
+      <w:r>
+        <w:t xml:space="preserve"> </w:t>
+      </w:r>
+      <w:r>
+        <w:t xml:space="preserve">(pestaña VIP de</w:t>
+      </w:r>
+      <w:r>
+        <w:t xml:space="preserve"> </w:t>
+      </w:r>
+      <w:r>
+        <w:rPr>
+          <w:b/>
+          <w:bCs/>
+        </w:rPr>
+        <w:t xml:space="preserve">Planes</w:t>
+      </w:r>
+      <w:r>
+        <w:t xml:space="preserve">) son personales: precio mensual,</w:t>
+      </w:r>
+      <w:r>
+        <w:t xml:space="preserve"> </w:t>
+      </w:r>
+      <w:r>
+        <w:t xml:space="preserve">lavados incluidos, descuento y días de anticipación. Las mensualidades se generan y</w:t>
+      </w:r>
+      <w:r>
+        <w:t xml:space="preserve"> </w:t>
+      </w:r>
+      <w:r>
+        <w:t xml:space="preserve">se aprueban desde ahí; el detalle está en el Manual de administrador, sección 1.5.</w:t>
+      </w:r>
+    </w:p>
+    <w:bookmarkEnd w:id="91"/>
+    <w:bookmarkStart w:id="92" w:name="reportes-1"/>
     <w:p>
       <w:pPr>
         <w:pStyle w:val="Heading3"/>
@@ -5099,9 +6959,9 @@
         <w:t xml:space="preserve">.</w:t>
       </w:r>
     </w:p>
-    <w:bookmarkEnd w:id="88"/>
-    <w:bookmarkEnd w:id="89"/>
-    <w:bookmarkStart w:id="90" w:name="preguntas-frecuentes-y-problemas"/>
+    <w:bookmarkEnd w:id="92"/>
+    <w:bookmarkEnd w:id="93"/>
+    <w:bookmarkStart w:id="94" w:name="preguntas-frecuentes-y-problemas"/>
     <w:p>
       <w:pPr>
         <w:pStyle w:val="Heading2"/>
@@ -5469,7 +7329,7 @@
               <w:jc w:val="left"/>
             </w:pPr>
             <w:r>
-              <w:t xml:space="preserve">La reserva aún no está confirmada. El operador debe confirmarla primero.</w:t>
+              <w:t xml:space="preserve">La reserva aún no está confirmada, o falta el pago. El operador debe confirmarla y el pago debe estar aprobado.</w:t>
             </w:r>
           </w:p>
         </w:tc>
@@ -5483,19 +7343,34 @@
               <w:jc w:val="left"/>
             </w:pPr>
             <w:r>
-              <w:t xml:space="preserve">No puedo cancelar</w:t>
-            </w:r>
-          </w:p>
-        </w:tc>
-        <w:tc>
-          <w:tcPr/>
-          <w:p>
-            <w:pPr>
-              <w:pStyle w:val="Compact"/>
-              <w:jc w:val="left"/>
-            </w:pPr>
-            <w:r>
-              <w:t xml:space="preserve">Una vez iniciado el lavado ya no se cancela desde la app. Comuníquese con la empresa.</w:t>
+              <w:t xml:space="preserve">Pagué y el lavado no empieza</w:t>
+            </w:r>
+          </w:p>
+        </w:tc>
+        <w:tc>
+          <w:tcPr/>
+          <w:p>
+            <w:pPr>
+              <w:pStyle w:val="Compact"/>
+              <w:jc w:val="left"/>
+            </w:pPr>
+            <w:r>
+              <w:t xml:space="preserve">El comprobante sigue</w:t>
+            </w:r>
+            <w:r>
+              <w:t xml:space="preserve"> </w:t>
+            </w:r>
+            <w:r>
+              <w:t xml:space="preserve">“</w:t>
+            </w:r>
+            <w:r>
+              <w:t xml:space="preserve">en verificación</w:t>
+            </w:r>
+            <w:r>
+              <w:t xml:space="preserve">”</w:t>
+            </w:r>
+            <w:r>
+              <w:t xml:space="preserve">. Hasta que el operador lo aprueba no cuenta como pagado.</w:t>
             </w:r>
           </w:p>
         </w:tc>
@@ -5509,31 +7384,19 @@
               <w:jc w:val="left"/>
             </w:pPr>
             <w:r>
-              <w:t xml:space="preserve">La app no abre o dice</w:t>
-            </w:r>
-            <w:r>
-              <w:t xml:space="preserve"> </w:t>
-            </w:r>
-            <w:r>
-              <w:t xml:space="preserve">“</w:t>
-            </w:r>
-            <w:r>
-              <w:t xml:space="preserve">Error de conexión con el servidor</w:t>
-            </w:r>
-            <w:r>
-              <w:t xml:space="preserve">”</w:t>
-            </w:r>
-          </w:p>
-        </w:tc>
-        <w:tc>
-          <w:tcPr/>
-          <w:p>
-            <w:pPr>
-              <w:pStyle w:val="Compact"/>
-              <w:jc w:val="left"/>
-            </w:pPr>
-            <w:r>
-              <w:t xml:space="preserve">Revise que el teléfono tenga internet (datos o wifi) y vuelva a intentar. Si sigue, avise al soporte.</w:t>
+              <w:t xml:space="preserve">No aparece la opción A domicilio</w:t>
+            </w:r>
+          </w:p>
+        </w:tc>
+        <w:tc>
+          <w:tcPr/>
+          <w:p>
+            <w:pPr>
+              <w:pStyle w:val="Compact"/>
+              <w:jc w:val="left"/>
+            </w:pPr>
+            <w:r>
+              <w:t xml:space="preserve">En su ciudad todavía no hay sectores con equipo móvil, o el servicio elegido no es expreso.</w:t>
             </w:r>
           </w:p>
         </w:tc>
@@ -5547,6 +7410,186 @@
               <w:jc w:val="left"/>
             </w:pPr>
             <w:r>
+              <w:t xml:space="preserve">Mi sector no está en la lista</w:t>
+            </w:r>
+          </w:p>
+        </w:tc>
+        <w:tc>
+          <w:tcPr/>
+          <w:p>
+            <w:pPr>
+              <w:pStyle w:val="Compact"/>
+              <w:jc w:val="left"/>
+            </w:pPr>
+            <w:r>
+              <w:t xml:space="preserve">Todavía no llegamos a esa zona. Puede reservar en un estacionamiento o en el taller.</w:t>
+            </w:r>
+          </w:p>
+        </w:tc>
+      </w:tr>
+      <w:tr>
+        <w:tc>
+          <w:tcPr/>
+          <w:p>
+            <w:pPr>
+              <w:pStyle w:val="Compact"/>
+              <w:jc w:val="left"/>
+            </w:pPr>
+            <w:r>
+              <w:t xml:space="preserve">No veo días más allá de dos semanas</w:t>
+            </w:r>
+          </w:p>
+        </w:tc>
+        <w:tc>
+          <w:tcPr/>
+          <w:p>
+            <w:pPr>
+              <w:pStyle w:val="Compact"/>
+              <w:jc w:val="left"/>
+            </w:pPr>
+            <w:r>
+              <w:t xml:space="preserve">Es el límite general. Con plan VIP se amplía a los días de su plan, si el mes está pagado.</w:t>
+            </w:r>
+          </w:p>
+        </w:tc>
+      </w:tr>
+      <w:tr>
+        <w:tc>
+          <w:tcPr/>
+          <w:p>
+            <w:pPr>
+              <w:pStyle w:val="Compact"/>
+              <w:jc w:val="left"/>
+            </w:pPr>
+            <w:r>
+              <w:t xml:space="preserve">Tengo plan VIP y me cobran precio normal</w:t>
+            </w:r>
+          </w:p>
+        </w:tc>
+        <w:tc>
+          <w:tcPr/>
+          <w:p>
+            <w:pPr>
+              <w:pStyle w:val="Compact"/>
+              <w:jc w:val="left"/>
+            </w:pPr>
+            <w:r>
+              <w:t xml:space="preserve">La mensualidad de ese mes no está aprobada todavía, o la reserva es de un mes que aún no pagó.</w:t>
+            </w:r>
+          </w:p>
+        </w:tc>
+      </w:tr>
+      <w:tr>
+        <w:tc>
+          <w:tcPr/>
+          <w:p>
+            <w:pPr>
+              <w:pStyle w:val="Compact"/>
+              <w:jc w:val="left"/>
+            </w:pPr>
+            <w:r>
+              <w:t xml:space="preserve">Soy empresa y no veo</w:t>
+            </w:r>
+            <w:r>
+              <w:t xml:space="preserve"> </w:t>
+            </w:r>
+            <w:r>
+              <w:t xml:space="preserve">“</w:t>
+            </w:r>
+            <w:r>
+              <w:t xml:space="preserve">Pagar</w:t>
+            </w:r>
+            <w:r>
+              <w:t xml:space="preserve">”</w:t>
+            </w:r>
+          </w:p>
+        </w:tc>
+        <w:tc>
+          <w:tcPr/>
+          <w:p>
+            <w:pPr>
+              <w:pStyle w:val="Compact"/>
+              <w:jc w:val="left"/>
+            </w:pPr>
+            <w:r>
+              <w:t xml:space="preserve">Es correcto: las empresas pagan con la factura del corte mensual.</w:t>
+            </w:r>
+          </w:p>
+        </w:tc>
+      </w:tr>
+      <w:tr>
+        <w:tc>
+          <w:tcPr/>
+          <w:p>
+            <w:pPr>
+              <w:pStyle w:val="Compact"/>
+              <w:jc w:val="left"/>
+            </w:pPr>
+            <w:r>
+              <w:t xml:space="preserve">No puedo cancelar</w:t>
+            </w:r>
+          </w:p>
+        </w:tc>
+        <w:tc>
+          <w:tcPr/>
+          <w:p>
+            <w:pPr>
+              <w:pStyle w:val="Compact"/>
+              <w:jc w:val="left"/>
+            </w:pPr>
+            <w:r>
+              <w:t xml:space="preserve">Una vez iniciado el lavado ya no se cancela desde la app. Comuníquese con la empresa.</w:t>
+            </w:r>
+          </w:p>
+        </w:tc>
+      </w:tr>
+      <w:tr>
+        <w:tc>
+          <w:tcPr/>
+          <w:p>
+            <w:pPr>
+              <w:pStyle w:val="Compact"/>
+              <w:jc w:val="left"/>
+            </w:pPr>
+            <w:r>
+              <w:t xml:space="preserve">La app no abre o dice</w:t>
+            </w:r>
+            <w:r>
+              <w:t xml:space="preserve"> </w:t>
+            </w:r>
+            <w:r>
+              <w:t xml:space="preserve">“</w:t>
+            </w:r>
+            <w:r>
+              <w:t xml:space="preserve">Error de conexión con el servidor</w:t>
+            </w:r>
+            <w:r>
+              <w:t xml:space="preserve">”</w:t>
+            </w:r>
+          </w:p>
+        </w:tc>
+        <w:tc>
+          <w:tcPr/>
+          <w:p>
+            <w:pPr>
+              <w:pStyle w:val="Compact"/>
+              <w:jc w:val="left"/>
+            </w:pPr>
+            <w:r>
+              <w:t xml:space="preserve">Revise que el teléfono tenga internet (datos o wifi) y vuelva a intentar. Si sigue, avise al soporte.</w:t>
+            </w:r>
+          </w:p>
+        </w:tc>
+      </w:tr>
+      <w:tr>
+        <w:tc>
+          <w:tcPr/>
+          <w:p>
+            <w:pPr>
+              <w:pStyle w:val="Compact"/>
+              <w:jc w:val="left"/>
+            </w:pPr>
+            <w:r>
               <w:t xml:space="preserve">La web muestra una versión vieja</w:t>
             </w:r>
           </w:p>
@@ -5615,8 +7658,8 @@
         <w:t xml:space="preserve">): con él encuentran todo el historial.</w:t>
       </w:r>
     </w:p>
-    <w:bookmarkEnd w:id="90"/>
-    <w:bookmarkStart w:id="91" w:name="mensajes-del-sistema"/>
+    <w:bookmarkEnd w:id="94"/>
+    <w:bookmarkStart w:id="95" w:name="mensajes-del-sistema"/>
     <w:p>
       <w:pPr>
         <w:pStyle w:val="Heading2"/>
@@ -6042,6 +8085,158 @@
           </w:p>
         </w:tc>
       </w:tr>
+      <w:tr>
+        <w:tc>
+          <w:tcPr/>
+          <w:p>
+            <w:pPr>
+              <w:pStyle w:val="Compact"/>
+              <w:jc w:val="left"/>
+            </w:pPr>
+            <w:r>
+              <w:t xml:space="preserve">No se puede iniciar el lavado: falta el pago de $X</w:t>
+            </w:r>
+          </w:p>
+        </w:tc>
+        <w:tc>
+          <w:tcPr/>
+          <w:p>
+            <w:pPr>
+              <w:pStyle w:val="Compact"/>
+              <w:jc w:val="left"/>
+            </w:pPr>
+            <w:r>
+              <w:t xml:space="preserve">La reserva tiene saldo</w:t>
+            </w:r>
+          </w:p>
+        </w:tc>
+        <w:tc>
+          <w:tcPr/>
+          <w:p>
+            <w:pPr>
+              <w:pStyle w:val="Compact"/>
+              <w:jc w:val="left"/>
+            </w:pPr>
+            <w:r>
+              <w:t xml:space="preserve">Pagar o aprobar el comprobante, y luego iniciar</w:t>
+            </w:r>
+          </w:p>
+        </w:tc>
+      </w:tr>
+      <w:tr>
+        <w:tc>
+          <w:tcPr/>
+          <w:p>
+            <w:pPr>
+              <w:pStyle w:val="Compact"/>
+              <w:jc w:val="left"/>
+            </w:pPr>
+            <w:r>
+              <w:t xml:space="preserve">Paga $X antes del lavado</w:t>
+            </w:r>
+          </w:p>
+        </w:tc>
+        <w:tc>
+          <w:tcPr/>
+          <w:p>
+            <w:pPr>
+              <w:pStyle w:val="Compact"/>
+              <w:jc w:val="left"/>
+            </w:pPr>
+            <w:r>
+              <w:t xml:space="preserve">Recordatorio en Mis Reservas</w:t>
+            </w:r>
+          </w:p>
+        </w:tc>
+        <w:tc>
+          <w:tcPr/>
+          <w:p>
+            <w:pPr>
+              <w:pStyle w:val="Compact"/>
+              <w:jc w:val="left"/>
+            </w:pPr>
+            <w:r>
+              <w:t xml:space="preserve">Transferir y subir el comprobante</w:t>
+            </w:r>
+          </w:p>
+        </w:tc>
+      </w:tr>
+      <w:tr>
+        <w:tc>
+          <w:tcPr/>
+          <w:p>
+            <w:pPr>
+              <w:pStyle w:val="Compact"/>
+              <w:jc w:val="left"/>
+            </w:pPr>
+            <w:r>
+              <w:t xml:space="preserve">Nuestro equipo va en camino</w:t>
+            </w:r>
+          </w:p>
+        </w:tc>
+        <w:tc>
+          <w:tcPr/>
+          <w:p>
+            <w:pPr>
+              <w:pStyle w:val="Compact"/>
+              <w:jc w:val="left"/>
+            </w:pPr>
+            <w:r>
+              <w:t xml:space="preserve">El equipo a domicilio salió</w:t>
+            </w:r>
+          </w:p>
+        </w:tc>
+        <w:tc>
+          <w:tcPr/>
+          <w:p>
+            <w:pPr>
+              <w:pStyle w:val="Compact"/>
+              <w:jc w:val="left"/>
+            </w:pPr>
+            <w:r>
+              <w:t xml:space="preserve">Tener listos el vehículo, el agua y la luz</w:t>
+            </w:r>
+          </w:p>
+        </w:tc>
+      </w:tr>
+      <w:tr>
+        <w:tc>
+          <w:tcPr/>
+          <w:p>
+            <w:pPr>
+              <w:pStyle w:val="Compact"/>
+              <w:jc w:val="left"/>
+            </w:pPr>
+            <w:r>
+              <w:t xml:space="preserve">No pudimos lavar en la visita</w:t>
+            </w:r>
+          </w:p>
+        </w:tc>
+        <w:tc>
+          <w:tcPr/>
+          <w:p>
+            <w:pPr>
+              <w:pStyle w:val="Compact"/>
+              <w:jc w:val="left"/>
+            </w:pPr>
+            <w:r>
+              <w:t xml:space="preserve">La visita a domicilio falló</w:t>
+            </w:r>
+          </w:p>
+        </w:tc>
+        <w:tc>
+          <w:tcPr/>
+          <w:p>
+            <w:pPr>
+              <w:pStyle w:val="Compact"/>
+              <w:jc w:val="left"/>
+            </w:pPr>
+            <w:r>
+              <w:t xml:space="preserve">Ver el motivo; se cobra el cargo de visita</w:t>
+            </w:r>
+          </w:p>
+        </w:tc>
+      </w:tr>
     </w:tbl>
     <w:p>
       <w:r>
@@ -6073,7 +8268,21 @@
           <w:i/>
           <w:iCs/>
         </w:rPr>
-        <w:t xml:space="preserve">prueba, solo con datos de demostración.</w:t>
+        <w:t xml:space="preserve">prueba, solo con datos de demostración. Las pantallas nuevas del 2026-10-12</w:t>
+      </w:r>
+      <w:r>
+        <w:rPr>
+          <w:i/>
+          <w:iCs/>
+        </w:rPr>
+        <w:t xml:space="preserve"> </w:t>
+      </w:r>
+      <w:r>
+        <w:rPr>
+          <w:i/>
+          <w:iCs/>
+        </w:rPr>
+        <w:t xml:space="preserve">(ciudad, a domicilio, Mi plan VIP, Mi flota) todavía no tienen captura.</w:t>
       </w:r>
     </w:p>
     <w:p>
@@ -6083,8 +8292,8 @@
         </w:pict>
       </w:r>
     </w:p>
-    <w:bookmarkEnd w:id="91"/>
-    <w:bookmarkStart w:id="92" w:name="control-de-versiones"/>
+    <w:bookmarkEnd w:id="95"/>
+    <w:bookmarkStart w:id="96" w:name="control-de-versiones"/>
     <w:p>
       <w:pPr>
         <w:pStyle w:val="Heading2"/>
@@ -6178,19 +8387,19 @@
               <w:jc w:val="left"/>
             </w:pPr>
             <w:r>
-              <w:t xml:space="preserve">2.1</w:t>
-            </w:r>
-          </w:p>
-        </w:tc>
-        <w:tc>
-          <w:tcPr/>
-          <w:p>
-            <w:pPr>
-              <w:pStyle w:val="Compact"/>
-              <w:jc w:val="left"/>
-            </w:pPr>
-            <w:r>
-              <w:t xml:space="preserve">2026-10-11</w:t>
+              <w:t xml:space="preserve">1.0</w:t>
+            </w:r>
+          </w:p>
+        </w:tc>
+        <w:tc>
+          <w:tcPr/>
+          <w:p>
+            <w:pPr>
+              <w:pStyle w:val="Compact"/>
+              <w:jc w:val="left"/>
+            </w:pPr>
+            <w:r>
+              <w:t xml:space="preserve">2026-10-12</w:t>
             </w:r>
           </w:p>
         </w:tc>
@@ -6246,7 +8455,7 @@
         <w:t xml:space="preserve">repositorio; la fuente es el archivo Markdown correspondiente.</w:t>
       </w:r>
     </w:p>
-    <w:bookmarkEnd w:id="92"/>
+    <w:bookmarkEnd w:id="96"/>
     <w:sectPr/>
   </w:body>
 </w:document>
@@ -6644,6 +8853,9 @@
     </w:lvlOverride>
   </w:num>
   <w:num w:numId="1007">
+    <w:abstractNumId w:val="991"/>
+  </w:num>
+  <w:num w:numId="1008">
     <w:abstractNumId w:val="99411"/>
     <w:lvlOverride w:ilvl="0">
       <w:startOverride w:val="1"/>
@@ -6673,38 +8885,8 @@
       <w:startOverride w:val="1"/>
     </w:lvlOverride>
   </w:num>
-  <w:num w:numId="1008">
+  <w:num w:numId="1009">
     <w:abstractNumId w:val="991"/>
-  </w:num>
-  <w:num w:numId="1009">
-    <w:abstractNumId w:val="99411"/>
-    <w:lvlOverride w:ilvl="0">
-      <w:startOverride w:val="1"/>
-    </w:lvlOverride>
-    <w:lvlOverride w:ilvl="1">
-      <w:startOverride w:val="1"/>
-    </w:lvlOverride>
-    <w:lvlOverride w:ilvl="2">
-      <w:startOverride w:val="1"/>
-    </w:lvlOverride>
-    <w:lvlOverride w:ilvl="3">
-      <w:startOverride w:val="1"/>
-    </w:lvlOverride>
-    <w:lvlOverride w:ilvl="4">
-      <w:startOverride w:val="1"/>
-    </w:lvlOverride>
-    <w:lvlOverride w:ilvl="5">
-      <w:startOverride w:val="1"/>
-    </w:lvlOverride>
-    <w:lvlOverride w:ilvl="6">
-      <w:startOverride w:val="1"/>
-    </w:lvlOverride>
-    <w:lvlOverride w:ilvl="7">
-      <w:startOverride w:val="1"/>
-    </w:lvlOverride>
-    <w:lvlOverride w:ilvl="8">
-      <w:startOverride w:val="1"/>
-    </w:lvlOverride>
   </w:num>
   <w:num w:numId="1010">
     <w:abstractNumId w:val="991"/>
@@ -6743,6 +8925,9 @@
     <w:abstractNumId w:val="991"/>
   </w:num>
   <w:num w:numId="1013">
+    <w:abstractNumId w:val="991"/>
+  </w:num>
+  <w:num w:numId="1014">
     <w:abstractNumId w:val="99411"/>
     <w:lvlOverride w:ilvl="0">
       <w:startOverride w:val="1"/>
@@ -6772,7 +8957,73 @@
       <w:startOverride w:val="1"/>
     </w:lvlOverride>
   </w:num>
-  <w:num w:numId="1014">
+  <w:num w:numId="1015">
+    <w:abstractNumId w:val="991"/>
+  </w:num>
+  <w:num w:numId="1016">
+    <w:abstractNumId w:val="99411"/>
+    <w:lvlOverride w:ilvl="0">
+      <w:startOverride w:val="1"/>
+    </w:lvlOverride>
+    <w:lvlOverride w:ilvl="1">
+      <w:startOverride w:val="1"/>
+    </w:lvlOverride>
+    <w:lvlOverride w:ilvl="2">
+      <w:startOverride w:val="1"/>
+    </w:lvlOverride>
+    <w:lvlOverride w:ilvl="3">
+      <w:startOverride w:val="1"/>
+    </w:lvlOverride>
+    <w:lvlOverride w:ilvl="4">
+      <w:startOverride w:val="1"/>
+    </w:lvlOverride>
+    <w:lvlOverride w:ilvl="5">
+      <w:startOverride w:val="1"/>
+    </w:lvlOverride>
+    <w:lvlOverride w:ilvl="6">
+      <w:startOverride w:val="1"/>
+    </w:lvlOverride>
+    <w:lvlOverride w:ilvl="7">
+      <w:startOverride w:val="1"/>
+    </w:lvlOverride>
+    <w:lvlOverride w:ilvl="8">
+      <w:startOverride w:val="1"/>
+    </w:lvlOverride>
+  </w:num>
+  <w:num w:numId="1017">
+    <w:abstractNumId w:val="991"/>
+  </w:num>
+  <w:num w:numId="1018">
+    <w:abstractNumId w:val="99411"/>
+    <w:lvlOverride w:ilvl="0">
+      <w:startOverride w:val="1"/>
+    </w:lvlOverride>
+    <w:lvlOverride w:ilvl="1">
+      <w:startOverride w:val="1"/>
+    </w:lvlOverride>
+    <w:lvlOverride w:ilvl="2">
+      <w:startOverride w:val="1"/>
+    </w:lvlOverride>
+    <w:lvlOverride w:ilvl="3">
+      <w:startOverride w:val="1"/>
+    </w:lvlOverride>
+    <w:lvlOverride w:ilvl="4">
+      <w:startOverride w:val="1"/>
+    </w:lvlOverride>
+    <w:lvlOverride w:ilvl="5">
+      <w:startOverride w:val="1"/>
+    </w:lvlOverride>
+    <w:lvlOverride w:ilvl="6">
+      <w:startOverride w:val="1"/>
+    </w:lvlOverride>
+    <w:lvlOverride w:ilvl="7">
+      <w:startOverride w:val="1"/>
+    </w:lvlOverride>
+    <w:lvlOverride w:ilvl="8">
+      <w:startOverride w:val="1"/>
+    </w:lvlOverride>
+  </w:num>
+  <w:num w:numId="1019">
     <w:abstractNumId w:val="991"/>
   </w:num>
 </w:numbering>

</xml_diff>